<commit_message>
Update README and Word report to be clear, natural and human-written
</commit_message>
<xml_diff>
--- a/Отчет_по_заданиям_Solana_3-7.docx
+++ b/Отчет_по_заданиям_Solana_3-7.docx
@@ -4,64 +4,61 @@
   <w:body>
     <w:p>
       <w:pPr>
-        <w:spacing w:before="200" w:after="40"/>
-        <w:jc w:val="center"/>
+        <w:spacing w:before="160" w:after="40"/>
       </w:pPr>
       <w:r>
         <w:rPr>
           <w:b/>
-          <w:color w:val="646E82"/>
-          <w:sz w:val="24"/>
+          <w:color w:val="646E7D"/>
+          <w:sz w:val="22"/>
         </w:rPr>
-        <w:t>ОТЧЕТ ПО ПРАКТИЧЕСКИМ РАБОТАМ</w:t>
+        <w:t>ОТЧЕТ О ВЫПОЛНЕНИИ ПРАКТИЧЕСКИХ ЗАДАНИЙ</w:t>
         <w:br/>
       </w:r>
       <w:r>
         <w:rPr>
           <w:b/>
-          <w:color w:val="9945FF"/>
-          <w:sz w:val="40"/>
+          <w:color w:val="5A1EB4"/>
+          <w:sz w:val="36"/>
         </w:rPr>
-        <w:t>Разработка смарт-контрактов и dApp на блокчейне Solana</w:t>
+        <w:t>Разработка на Solana: Rust, Anchor, PDA и SPL Токены</w:t>
         <w:br/>
-        <w:t>(Задания 3 — 7)</w:t>
+        <w:t>(Задания с 3 по 7 неделю)</w:t>
       </w:r>
     </w:p>
     <w:p>
       <w:pPr>
-        <w:spacing w:after="400"/>
-        <w:jc w:val="center"/>
+        <w:spacing w:after="320"/>
       </w:pPr>
       <w:r>
         <w:rPr>
           <w:i/>
-          <w:color w:val="646E82"/>
+          <w:color w:val="646E7D"/>
           <w:sz w:val="22"/>
         </w:rPr>
-        <w:t>Дисциплина: Startup / Web3 Engineering • Экосистема Solana, Rust &amp; Anchor</w:t>
+        <w:t>Дисциплина: Startup / Web3 • Выполнил: Nerdlin</w:t>
       </w:r>
     </w:p>
     <w:tbl>
       <w:tblPr>
         <w:tblW w:type="auto" w:w="0"/>
         <w:jc w:val="center"/>
-        <w:tblLayout w:type="fixed"/>
         <w:tblLook w:firstColumn="1" w:firstRow="1" w:lastColumn="0" w:lastRow="0" w:noHBand="0" w:noVBand="1" w:val="04A0"/>
       </w:tblPr>
       <w:tblGrid>
         <w:gridCol w:w="3168"/>
-        <w:gridCol w:w="6480"/>
+        <w:gridCol w:w="6768"/>
       </w:tblGrid>
       <w:tr>
         <w:tc>
           <w:tcPr>
-            <w:tcW w:type="dxa" w:w="4824"/>
+            <w:tcW w:type="dxa" w:w="4896"/>
             <w:shd w:fill="F3F4F6"/>
             <w:tcMar>
-              <w:top w:w="80" w:type="dxa"/>
-              <w:bottom w:w="80" w:type="dxa"/>
-              <w:left w:w="120" w:type="dxa"/>
-              <w:right w:w="120" w:type="dxa"/>
+              <w:top w:w="60" w:type="dxa"/>
+              <w:bottom w:w="60" w:type="dxa"/>
+              <w:left w:w="100" w:type="dxa"/>
+              <w:right w:w="100" w:type="dxa"/>
             </w:tcMar>
           </w:tcPr>
           <w:p>
@@ -70,19 +67,19 @@
                 <w:b/>
                 <w:sz w:val="20"/>
               </w:rPr>
-              <w:t>Студент / Разработчик:</w:t>
+              <w:t>Студент:</w:t>
             </w:r>
           </w:p>
         </w:tc>
         <w:tc>
           <w:tcPr>
-            <w:tcW w:type="dxa" w:w="4824"/>
+            <w:tcW w:type="dxa" w:w="4896"/>
             <w:shd w:fill="FAFAFA"/>
             <w:tcMar>
-              <w:top w:w="80" w:type="dxa"/>
-              <w:bottom w:w="80" w:type="dxa"/>
-              <w:left w:w="120" w:type="dxa"/>
-              <w:right w:w="120" w:type="dxa"/>
+              <w:top w:w="60" w:type="dxa"/>
+              <w:bottom w:w="60" w:type="dxa"/>
+              <w:left w:w="100" w:type="dxa"/>
+              <w:right w:w="100" w:type="dxa"/>
             </w:tcMar>
           </w:tcPr>
           <w:p>
@@ -98,13 +95,13 @@
       <w:tr>
         <w:tc>
           <w:tcPr>
-            <w:tcW w:type="dxa" w:w="4824"/>
+            <w:tcW w:type="dxa" w:w="4896"/>
             <w:shd w:fill="F3F4F6"/>
             <w:tcMar>
-              <w:top w:w="80" w:type="dxa"/>
-              <w:bottom w:w="80" w:type="dxa"/>
-              <w:left w:w="120" w:type="dxa"/>
-              <w:right w:w="120" w:type="dxa"/>
+              <w:top w:w="60" w:type="dxa"/>
+              <w:bottom w:w="60" w:type="dxa"/>
+              <w:left w:w="100" w:type="dxa"/>
+              <w:right w:w="100" w:type="dxa"/>
             </w:tcMar>
           </w:tcPr>
           <w:p>
@@ -113,19 +110,19 @@
                 <w:b/>
                 <w:sz w:val="20"/>
               </w:rPr>
-              <w:t>Тематический охват:</w:t>
+              <w:t>Охват работы:</w:t>
             </w:r>
           </w:p>
         </w:tc>
         <w:tc>
           <w:tcPr>
-            <w:tcW w:type="dxa" w:w="4824"/>
+            <w:tcW w:type="dxa" w:w="4896"/>
             <w:shd w:fill="FAFAFA"/>
             <w:tcMar>
-              <w:top w:w="80" w:type="dxa"/>
-              <w:bottom w:w="80" w:type="dxa"/>
-              <w:left w:w="120" w:type="dxa"/>
-              <w:right w:w="120" w:type="dxa"/>
+              <w:top w:w="60" w:type="dxa"/>
+              <w:bottom w:w="60" w:type="dxa"/>
+              <w:left w:w="100" w:type="dxa"/>
+              <w:right w:w="100" w:type="dxa"/>
             </w:tcMar>
           </w:tcPr>
           <w:p>
@@ -133,7 +130,7 @@
               <w:rPr>
                 <w:sz w:val="20"/>
               </w:rPr>
-              <w:t>Недели 3, 4, 5, 6, 7 учебного силлабуса</w:t>
+              <w:t>Недели 3, 4, 5, 6, 7 учебного плана</w:t>
             </w:r>
           </w:p>
         </w:tc>
@@ -141,13 +138,13 @@
       <w:tr>
         <w:tc>
           <w:tcPr>
-            <w:tcW w:type="dxa" w:w="4824"/>
+            <w:tcW w:type="dxa" w:w="4896"/>
             <w:shd w:fill="F3F4F6"/>
             <w:tcMar>
-              <w:top w:w="80" w:type="dxa"/>
-              <w:bottom w:w="80" w:type="dxa"/>
-              <w:left w:w="120" w:type="dxa"/>
-              <w:right w:w="120" w:type="dxa"/>
+              <w:top w:w="60" w:type="dxa"/>
+              <w:bottom w:w="60" w:type="dxa"/>
+              <w:left w:w="100" w:type="dxa"/>
+              <w:right w:w="100" w:type="dxa"/>
             </w:tcMar>
           </w:tcPr>
           <w:p>
@@ -156,19 +153,19 @@
                 <w:b/>
                 <w:sz w:val="20"/>
               </w:rPr>
-              <w:t>Стек технологий:</w:t>
+              <w:t>Используемый стек:</w:t>
             </w:r>
           </w:p>
         </w:tc>
         <w:tc>
           <w:tcPr>
-            <w:tcW w:type="dxa" w:w="4824"/>
+            <w:tcW w:type="dxa" w:w="4896"/>
             <w:shd w:fill="FAFAFA"/>
             <w:tcMar>
-              <w:top w:w="80" w:type="dxa"/>
-              <w:bottom w:w="80" w:type="dxa"/>
-              <w:left w:w="120" w:type="dxa"/>
-              <w:right w:w="120" w:type="dxa"/>
+              <w:top w:w="60" w:type="dxa"/>
+              <w:bottom w:w="60" w:type="dxa"/>
+              <w:left w:w="100" w:type="dxa"/>
+              <w:right w:w="100" w:type="dxa"/>
             </w:tcMar>
           </w:tcPr>
           <w:p>
@@ -176,7 +173,7 @@
               <w:rPr>
                 <w:sz w:val="20"/>
               </w:rPr>
-              <w:t>Rust, Borsh, Solana Program SDK, Anchor Framework 0.30, TypeScript, @solana/web3.js, @solana/spl-token, Metaplex</w:t>
+              <w:t>Rust, Borsh, solana-program, Anchor 0.30, TypeScript, @solana/web3.js, @solana/spl-token, Metaplex</w:t>
             </w:r>
           </w:p>
         </w:tc>
@@ -187,63 +184,31 @@
         <w:spacing w:after="200"/>
       </w:pPr>
     </w:p>
-    <w:tbl>
-      <w:tblPr>
-        <w:tblW w:type="auto" w:w="0"/>
-        <w:jc w:val="center"/>
-        <w:tblLook w:firstColumn="1" w:firstRow="1" w:lastColumn="0" w:lastRow="0" w:noHBand="0" w:noVBand="1" w:val="04A0"/>
-      </w:tblPr>
-      <w:tblGrid>
-        <w:gridCol w:w="9648"/>
-      </w:tblGrid>
-      <w:tr>
-        <w:tc>
-          <w:tcPr>
-            <w:tcW w:type="dxa" w:w="9648"/>
-            <w:shd w:fill="F5F0FF"/>
-            <w:tcMar>
-              <w:top w:w="120" w:type="dxa"/>
-              <w:bottom w:w="120" w:type="dxa"/>
-              <w:left w:w="180" w:type="dxa"/>
-              <w:right w:w="180" w:type="dxa"/>
-            </w:tcMar>
-          </w:tcPr>
-          <w:p>
-            <w:r>
-              <w:rPr>
-                <w:i/>
-                <w:sz w:val="21"/>
-              </w:rPr>
-              <w:t>Аннотация: В рамках выполнения заданий модулей с 3 по 7 была пройдена полная траектория Solana-разработчика: от фундаментальных конструкций языка Rust и низкоуровневой сериализации Borsh до деплоя нативных смарт-контрактов в Devnet, промышленной разработки на фреймворке Anchor, архитектуры учетных записей PDA (Program Derived Addresses) и управления токенами стандарта SPL Token.</w:t>
-            </w:r>
-          </w:p>
-        </w:tc>
-      </w:tr>
-    </w:tbl>
     <w:p>
       <w:pPr>
-        <w:spacing w:after="300"/>
-      </w:pPr>
-    </w:p>
-    <w:p>
-      <w:pPr>
-        <w:spacing w:before="360" w:after="120"/>
+        <w:spacing w:after="240"/>
       </w:pPr>
       <w:r>
         <w:rPr>
           <w:b/>
-          <w:color w:val="9945FF"/>
-          <w:sz w:val="28"/>
         </w:rPr>
-        <w:t xml:space="preserve">РАЗДЕЛ 1 (Неделя 3). </w:t>
+        <w:t xml:space="preserve">О чем эта работа: </w:t>
       </w:r>
+      <w:r>
+        <w:t>В этом отчете собрано описание пяти практических заданий курса. Цель — последовательно пройти путь создания смарт-контрактов для Solana: разобраться с низкоуровневой моделью аккаунтов и сериализацией на Rust, задеплоить первую нативную программу в Devnet, перейти на современный фреймворк Anchor, реализовать хранение данных через PDA и настроить выпуск и переводы собственных токенов стандарта SPL.</w:t>
+      </w:r>
+    </w:p>
+    <w:p>
+      <w:pPr>
+        <w:spacing w:before="320" w:after="80"/>
+      </w:pPr>
       <w:r>
         <w:rPr>
           <w:b/>
-          <w:color w:val="181E2A"/>
-          <w:sz w:val="28"/>
+          <w:color w:val="5A1EB4"/>
+          <w:sz w:val="26"/>
         </w:rPr>
-        <w:t>Rust для Solana-разработчика (CLI-программа)</w:t>
+        <w:t>1. Неделя 3: Rust для Solana-разработчика (CLI-симулятор)</w:t>
       </w:r>
     </w:p>
     <w:p>
@@ -251,10 +216,10 @@
         <w:rPr>
           <w:b/>
         </w:rPr>
-        <w:t xml:space="preserve">Формулировка задания: </w:t>
+        <w:t xml:space="preserve">Что нужно было сделать: </w:t>
       </w:r>
       <w:r>
-        <w:t>Создать небольшую CLI-программу на Rust с использованием конструкций, которые понадобятся в Solana-разработке.</w:t>
+        <w:t>Написать небольшую CLI-программу на Rust с использованием базовых конструкций, которые понадобятся при разработке контрактов в Solana.</w:t>
       </w:r>
     </w:p>
     <w:p>
@@ -262,10 +227,12 @@
         <w:rPr>
           <w:b/>
         </w:rPr>
-        <w:t xml:space="preserve">Реализация и архитектура: </w:t>
+        <w:t>Что я сделал и почему именно так:</w:t>
+        <w:br/>
       </w:r>
       <w:r>
-        <w:t>В директории week3_rust_cli разработан полноценный эмулятор рантайма виртуальной машины Solana (SVM) на чистом Rust. Программа воспроизводит ключевые механизмы, с которыми разработчик сталкивается при написании смарт-контрактов:</w:t>
+        <w:t>Вместо абстрактных примеров я написал эмулятор рантайма Solana (папка week3_rust_cli), который моделирует, как блокчейн обрабатывает транзакции и изменяет состояние аккаунтов. В коде применены ключевые вещи, без которых смарт-контракты не пишутся:</w:t>
+        <w:br/>
       </w:r>
     </w:p>
     <w:p>
@@ -277,10 +244,10 @@
         <w:rPr>
           <w:b/>
         </w:rPr>
-        <w:t xml:space="preserve">Бинарная сериализация Borsh: </w:t>
+        <w:t xml:space="preserve">Сериализация Borsh: </w:t>
       </w:r>
       <w:r>
-        <w:t>Solana использует формат Borsh вместо JSON. В проекте структуры состояния (CounterState, UserProfileState) и инструкции (ProgramInstruction) сериализуются/десериализуются в компактные байтовые буферы через #[derive(BorshSerialize, BorshDeserialize)].</w:t>
+        <w:t>Solana не использует тяжелый JSON — все данные сериализуются в компактный бинарный формат Borsh. В проекте через derive макросы запаковываются и инструкции (ProgramInstruction), и структуры состояния (CounterState, UserProfileState).</w:t>
       </w:r>
     </w:p>
     <w:p>
@@ -295,7 +262,7 @@
         <w:t xml:space="preserve">Модель аккаунтов (Account &amp; Pubkey): </w:t>
       </w:r>
       <w:r>
-        <w:t>Реализовано хранилище данных аккаунтов с 32-байтными публичными ключами, балансом в лампортах (1 SOL = 10^9 лампортов), флагами подписи (is_signer) и права на запись (is_writable).</w:t>
+        <w:t>Описал структуру аккаунта: 32-байтный публичный ключ, баланс в лампортах, буфер данных и флаги signer (подписана ли транзакция владельцем) и writable (можно ли менять).</w:t>
       </w:r>
     </w:p>
     <w:p>
@@ -307,10 +274,10 @@
         <w:rPr>
           <w:b/>
         </w:rPr>
-        <w:t xml:space="preserve">Точка входа процессора (Processor): </w:t>
+        <w:t xml:space="preserve">Точка входа процессора: </w:t>
       </w:r>
       <w:r>
-        <w:t>Функция Processor::process воспроизводит сигнатуру нативного рантайма process_instruction(&amp;Pubkey, &amp;mut [Account], &amp;[u8]).</w:t>
+        <w:t>Функция Processor::process в точности повторяет сигнатуру стандартного entrypoint Solana: принимает program_id, срез аккаунтов и сырые байты инструкции.</w:t>
       </w:r>
     </w:p>
     <w:p>
@@ -322,10 +289,10 @@
         <w:rPr>
           <w:b/>
         </w:rPr>
-        <w:t xml:space="preserve">Управление памятью и Borrow Checker: </w:t>
+        <w:t xml:space="preserve">Borrow Checker и split_at_mut: </w:t>
       </w:r>
       <w:r>
-        <w:t>Безопасное одновременное изменение состояния двух аккаунтов при переводе средств через безопасное разделение мутабельного среза accounts.split_at_mut(1).</w:t>
+        <w:t>В Rust нельзя одновременно взять две мутабельные ссылки на элементы одного вектора. Чтобы списать деньги с одного аккаунта и зачислить на другой, используется accounts.split_at_mut(1) — ровно так, как это делается в реальных контрактах.</w:t>
       </w:r>
     </w:p>
     <w:p>
@@ -337,10 +304,10 @@
         <w:rPr>
           <w:b/>
         </w:rPr>
-        <w:t xml:space="preserve">Безопасная арифметика и ошибки: </w:t>
+        <w:t xml:space="preserve">Защищенная арифметика: </w:t>
       </w:r>
       <w:r>
-        <w:t>Защита от целочисленного переполнения с помощью checked_add и checked_sub, исключающая типичные уязвимости смарт-контрактов.</w:t>
+        <w:t>Все вычисления балансов и счетчиков сделаны через checked_add и checked_sub с возвратом ошибки ProgramError::ArithmeticOverflow при переполнении.</w:t>
       </w:r>
     </w:p>
     <w:tbl>
@@ -350,33 +317,33 @@
         <w:tblLook w:firstColumn="1" w:firstRow="1" w:lastColumn="0" w:lastRow="0" w:noHBand="0" w:noVBand="1" w:val="04A0"/>
       </w:tblPr>
       <w:tblGrid>
-        <w:gridCol w:w="9648"/>
+        <w:gridCol w:w="9792"/>
       </w:tblGrid>
       <w:tr>
         <w:tc>
           <w:tcPr>
-            <w:tcW w:type="dxa" w:w="9648"/>
-            <w:shd w:fill="F0FDF4"/>
+            <w:tcW w:type="dxa" w:w="9936"/>
+            <w:shd w:fill="F5F3FF"/>
             <w:tcMar>
-              <w:top w:w="100" w:type="dxa"/>
-              <w:bottom w:w="100" w:type="dxa"/>
-              <w:left w:w="150" w:type="dxa"/>
-              <w:right w:w="150" w:type="dxa"/>
+              <w:top w:w="80" w:type="dxa"/>
+              <w:bottom w:w="80" w:type="dxa"/>
+              <w:left w:w="120" w:type="dxa"/>
+              <w:right w:w="120" w:type="dxa"/>
             </w:tcMar>
           </w:tcPr>
           <w:p>
             <w:r>
               <w:rPr>
                 <w:b/>
-                <w:color w:val="166534"/>
+                <w:color w:val="5A1EB4"/>
               </w:rPr>
-              <w:t xml:space="preserve">💡 Результат проверки: </w:t>
+              <w:t xml:space="preserve">📌 Как проверить: </w:t>
             </w:r>
             <w:r>
               <w:rPr>
-                <w:sz w:val="20"/>
+                <w:sz w:val="19"/>
               </w:rPr>
-              <w:t>Программа скомпилирована с помощью инструментария cargo и протестирована сценарием 'cargo run -- demo'. Все тесты сериализации, проверки прав подписи и отлова ошибок (нехватка средств, неверный владелец) успешно пройдены.</w:t>
+              <w:t>В папке week3_rust_cli выполнить: cargo run -- demo. Программа наглядно выполнит сериализацию, инициализирует счетчик, сделает перевод лампортов и покажет перехват ошибок при нехватке денег или отсутствии подписи.</w:t>
             </w:r>
           </w:p>
         </w:tc>
@@ -389,23 +356,15 @@
     </w:p>
     <w:p>
       <w:pPr>
-        <w:spacing w:before="360" w:after="120"/>
+        <w:spacing w:before="320" w:after="80"/>
       </w:pPr>
       <w:r>
         <w:rPr>
           <w:b/>
-          <w:color w:val="9945FF"/>
-          <w:sz w:val="28"/>
+          <w:color w:val="5A1EB4"/>
+          <w:sz w:val="26"/>
         </w:rPr>
-        <w:t xml:space="preserve">РАЗДЕЛ 2 (Неделя 4). </w:t>
-      </w:r>
-      <w:r>
-        <w:rPr>
-          <w:b/>
-          <w:color w:val="181E2A"/>
-          <w:sz w:val="28"/>
-        </w:rPr>
-        <w:t>Первая Solana Program на Devnet</w:t>
+        <w:t>2. Неделя 4: Первая Solana Program на Devnet</w:t>
       </w:r>
     </w:p>
     <w:p>
@@ -413,10 +372,10 @@
         <w:rPr>
           <w:b/>
         </w:rPr>
-        <w:t xml:space="preserve">Формулировка задания: </w:t>
+        <w:t xml:space="preserve">Что нужно было сделать: </w:t>
       </w:r>
       <w:r>
-        <w:t>Создать и задеплоить первую Solana Program в Devnet.</w:t>
+        <w:t>Создать и задеплоить свою первую программу в тестовую сеть Solana Devnet.</w:t>
       </w:r>
     </w:p>
     <w:p>
@@ -424,10 +383,12 @@
         <w:rPr>
           <w:b/>
         </w:rPr>
-        <w:t xml:space="preserve">Реализация и архитектура: </w:t>
+        <w:t>Как устроено решение:</w:t>
+        <w:br/>
       </w:r>
       <w:r>
-        <w:t>В директории week4_solana_program реализован нативный смарт-контракт на Rust и TypeScript-клиент для взаимодействия с тестовой сетью Solana Devnet:</w:t>
+        <w:t>В папке week4_solana_program лежит нативный контракт на Rust и клиентский скрипт на TypeScript:</w:t>
+        <w:br/>
       </w:r>
     </w:p>
     <w:p>
@@ -439,10 +400,10 @@
         <w:rPr>
           <w:b/>
         </w:rPr>
-        <w:t xml:space="preserve">Смарт-контракт (src/lib.rs): </w:t>
+        <w:t xml:space="preserve">Контракт (src/lib.rs): </w:t>
       </w:r>
       <w:r>
-        <w:t>Использует библиотеку solana-program, макрос entrypoint!(process_instruction) и логирование событий в ончейн-журнал msg!().</w:t>
+        <w:t>Написан на базе библиотеки solana-program. Содержит точку входа entrypoint!(process_instruction) и логирование событий в ончейн msg!().</w:t>
       </w:r>
     </w:p>
     <w:p>
@@ -454,10 +415,10 @@
         <w:rPr>
           <w:b/>
         </w:rPr>
-        <w:t xml:space="preserve">Проверка владельца аккаунта: </w:t>
+        <w:t xml:space="preserve">Проверка владельца (Owner check): </w:t>
       </w:r>
       <w:r>
-        <w:t>Программа строго валидирует, что переданный аккаунт данных принадлежит ей (account.owner == program_id), предотвращая несанкционированную модификацию.</w:t>
+        <w:t>Обязательное правило безопасности Solana: программа обязательно проверяет account.owner == program_id. Если аккаунт принадлежит кому-то другому, программа отказывается его менять и возвращает ошибку.</w:t>
       </w:r>
     </w:p>
     <w:p>
@@ -469,10 +430,10 @@
         <w:rPr>
           <w:b/>
         </w:rPr>
-        <w:t xml:space="preserve">Структура GreetingAccount: </w:t>
+        <w:t xml:space="preserve">Состояние счетчика (GreetingAccount): </w:t>
       </w:r>
       <w:r>
-        <w:t>Хранит счетчик вызовов counter: u32 и динамическое строковое сообщение message: String.</w:t>
+        <w:t>В аккаунте хранится количество вызовов программы и кастомная строка с сообщением, которую можно передать в транзакции.</w:t>
       </w:r>
     </w:p>
     <w:p>
@@ -484,10 +445,10 @@
         <w:rPr>
           <w:b/>
         </w:rPr>
-        <w:t xml:space="preserve">Интерактивный клиент (@solana/web3.js): </w:t>
+        <w:t xml:space="preserve">Клиент на @solana/web3.js (client/client.ts): </w:t>
       </w:r>
       <w:r>
-        <w:t>Скрипт client/client.ts автоматически создает аккаунт данных через SystemProgram.createAccount, оплачивает освобождение от арендной платы (Rent Exemption), пакует инструкцию вызова контракта и отправляет транзакцию в Devnet.</w:t>
+        <w:t>Клиент подключается к Devnet, запрашивает аирдроп тестовых SOL, рассчитывает стоимость освобождения от арендной платы (Rent Exemption), создает аккаунт данных и отправляет транзакцию на вызов контракта.</w:t>
       </w:r>
     </w:p>
     <w:p>
@@ -499,10 +460,10 @@
         <w:rPr>
           <w:b/>
         </w:rPr>
-        <w:t xml:space="preserve">Инструкция по развертыванию: </w:t>
+        <w:t xml:space="preserve">Деплой: </w:t>
       </w:r>
       <w:r>
-        <w:t>Подготовлено пошаговое руководство по деплою как через веб-среду Solana Playground (beta.solpg.io), так и через solana program deploy.</w:t>
+        <w:t>Программу проще всего задеплоить через веб-инструмент Solana Playground (beta.solpg.io) — достаточно вставить код из src/lib.rs, нажать Build и Deploy.</w:t>
       </w:r>
     </w:p>
     <w:tbl>
@@ -512,33 +473,33 @@
         <w:tblLook w:firstColumn="1" w:firstRow="1" w:lastColumn="0" w:lastRow="0" w:noHBand="0" w:noVBand="1" w:val="04A0"/>
       </w:tblPr>
       <w:tblGrid>
-        <w:gridCol w:w="9648"/>
+        <w:gridCol w:w="9792"/>
       </w:tblGrid>
       <w:tr>
         <w:tc>
           <w:tcPr>
-            <w:tcW w:type="dxa" w:w="9648"/>
-            <w:shd w:fill="F0FDF4"/>
+            <w:tcW w:type="dxa" w:w="9936"/>
+            <w:shd w:fill="F5F3FF"/>
             <w:tcMar>
-              <w:top w:w="100" w:type="dxa"/>
-              <w:bottom w:w="100" w:type="dxa"/>
-              <w:left w:w="150" w:type="dxa"/>
-              <w:right w:w="150" w:type="dxa"/>
+              <w:top w:w="80" w:type="dxa"/>
+              <w:bottom w:w="80" w:type="dxa"/>
+              <w:left w:w="120" w:type="dxa"/>
+              <w:right w:w="120" w:type="dxa"/>
             </w:tcMar>
           </w:tcPr>
           <w:p>
             <w:r>
               <w:rPr>
                 <w:b/>
-                <w:color w:val="166534"/>
+                <w:color w:val="5A1EB4"/>
               </w:rPr>
-              <w:t xml:space="preserve">💡 Результат проверки: </w:t>
+              <w:t xml:space="preserve">📌 Как проверить: </w:t>
             </w:r>
             <w:r>
               <w:rPr>
-                <w:sz w:val="20"/>
+                <w:sz w:val="19"/>
               </w:rPr>
-              <w:t>Транзакции контракта генерируют публичный хэш и верифицируются через официальный обозреватель Solana Explorer (https://explorer.solana.com/?cluster=devnet).</w:t>
+              <w:t>Для взаимодействия с задеплоенной программой перейти в week4_solana_program/client, выполнить npm install и npx ts-node client.ts &lt;ID_ПРОГРАММЫ&gt;. Клиент выведет прямую ссылку на транзакцию в Solana Explorer.</w:t>
             </w:r>
           </w:p>
         </w:tc>
@@ -551,23 +512,15 @@
     </w:p>
     <w:p>
       <w:pPr>
-        <w:spacing w:before="360" w:after="120"/>
+        <w:spacing w:before="320" w:after="80"/>
       </w:pPr>
       <w:r>
         <w:rPr>
           <w:b/>
-          <w:color w:val="9945FF"/>
-          <w:sz w:val="28"/>
+          <w:color w:val="5A1EB4"/>
+          <w:sz w:val="26"/>
         </w:rPr>
-        <w:t xml:space="preserve">РАЗДЕЛ 3 (Неделя 5). </w:t>
-      </w:r>
-      <w:r>
-        <w:rPr>
-          <w:b/>
-          <w:color w:val="181E2A"/>
-          <w:sz w:val="28"/>
-        </w:rPr>
-        <w:t>Anchor Framework (Counter Program)</w:t>
+        <w:t>3. Неделя 5: Фреймворк Anchor (Counter Program)</w:t>
       </w:r>
     </w:p>
     <w:p>
@@ -575,10 +528,10 @@
         <w:rPr>
           <w:b/>
         </w:rPr>
-        <w:t xml:space="preserve">Формулировка задания: </w:t>
+        <w:t xml:space="preserve">Что нужно было сделать: </w:t>
       </w:r>
       <w:r>
-        <w:t>Создать Counter Program и взаимодействовать с ней через client.</w:t>
+        <w:t>Написать программу-счетчик с использованием фреймворка Anchor и протестировать работу с ней через клиент.</w:t>
       </w:r>
     </w:p>
     <w:p>
@@ -586,10 +539,12 @@
         <w:rPr>
           <w:b/>
         </w:rPr>
-        <w:t xml:space="preserve">Реализация и архитектура: </w:t>
+        <w:t>Зачем нужен Anchor и что реализовано:</w:t>
+        <w:br/>
       </w:r>
       <w:r>
-        <w:t>В директории week5_anchor_counter разработан смарт-контракт на индустриальном стандарте Anchor Framework (v0.30). Anchor исключает написание шаблонного кода валидации и автоматизирует вычисление 8-байтных дискриминаторов типов аккаунтов:</w:t>
+        <w:t>В нативном Rust разработчику приходится писать сотни строк рутинного кода для проверки аккаунтов и парсинга байтов. Anchor решает эту проблему декларативными макросами #[derive(Accounts)]. В проекте week5_anchor_counter реализовано:</w:t>
+        <w:br/>
       </w:r>
     </w:p>
     <w:p>
@@ -601,10 +556,10 @@
         <w:rPr>
           <w:b/>
         </w:rPr>
-        <w:t xml:space="preserve">Инструкция initialize: </w:t>
+        <w:t xml:space="preserve">Инструкции: </w:t>
       </w:r>
       <w:r>
-        <w:t>Инициализирует аккаунт счетчика, устанавливает authority = user.key() и выделяет точный объем памяти: 8 байт дискриминатора + 8 байт u64 + 32 байта публичного ключа.</w:t>
+        <w:t>initialize (создание счетчика и привязка authority), increment (увеличение на 1), decrement (уменьшение на 1) и set_value (установка конкретного числа владельцем).</w:t>
       </w:r>
     </w:p>
     <w:p>
@@ -616,10 +571,10 @@
         <w:rPr>
           <w:b/>
         </w:rPr>
-        <w:t xml:space="preserve">Инструкция increment: </w:t>
+        <w:t xml:space="preserve">Защита от ухода в минус: </w:t>
       </w:r>
       <w:r>
-        <w:t>Безопасно увеличивает счетчик с защитой от переполнения (checked_add, ErrorCode::Overflow).</w:t>
+        <w:t>В инструкции decrement добавлено строгое условие require!(counter.count &gt; 0, ErrorCode::Underflow). Если счетчик уже равен 0, транзакция прерывается с понятной ошибкой.</w:t>
       </w:r>
     </w:p>
     <w:p>
@@ -631,10 +586,10 @@
         <w:rPr>
           <w:b/>
         </w:rPr>
-        <w:t xml:space="preserve">Инструкция decrement: </w:t>
+        <w:t xml:space="preserve">Проверка прав: </w:t>
       </w:r>
       <w:r>
-        <w:t>Уменьшает значение с обязательным ограничением require!(counter.count &gt; 0, ErrorCode::Underflow).</w:t>
+        <w:t>В set_value использован констрейнт has_one = authority @ ErrorCode::Unauthorized. Никто, кроме создателя этого счетчика, не сможет принудительно изменить его значение.</w:t>
       </w:r>
     </w:p>
     <w:p>
@@ -646,10 +601,10 @@
         <w:rPr>
           <w:b/>
         </w:rPr>
-        <w:t xml:space="preserve">Инструкция set_value: </w:t>
+        <w:t xml:space="preserve">Тесты на Mocha/Chai (tests/counter.ts): </w:t>
       </w:r>
       <w:r>
-        <w:t>Позволяет установить произвольное значение счетчика со строгой верификацией прав владельца через декларативный констрейнт has_one = authority @ ErrorCode::Unauthorized.</w:t>
+        <w:t>Написаны тесты под все сценарии, включая проверку того, что ошибка Underflow действительно выбрасывается при попытке уйти в минус.</w:t>
       </w:r>
     </w:p>
     <w:p>
@@ -661,25 +616,10 @@
         <w:rPr>
           <w:b/>
         </w:rPr>
-        <w:t xml:space="preserve">Модульные тесты (tests/counter.ts): </w:t>
+        <w:t xml:space="preserve">Клиент (client/interact.ts): </w:t>
       </w:r>
       <w:r>
-        <w:t>Реализовано полное покрытие сценариев на базе Mocha и Chai, включая тестирование отлова ошибок Underflow при попытке уйти в минус.</w:t>
-      </w:r>
-    </w:p>
-    <w:p>
-      <w:pPr>
-        <w:pStyle w:val="ListBullet"/>
-        <w:spacing w:after="40"/>
-      </w:pPr>
-      <w:r>
-        <w:rPr>
-          <w:b/>
-        </w:rPr>
-        <w:t xml:space="preserve">Автономный TypeScript-клиент: </w:t>
-      </w:r>
-      <w:r>
-        <w:t>Скрипт client/interact.ts готов для отправки инструкций в Devnet с типизацией IDL.</w:t>
+        <w:t>Готовый скрипт для вызова инструкций через сгенерированный IDL на Devnet.</w:t>
       </w:r>
     </w:p>
     <w:tbl>
@@ -689,33 +629,33 @@
         <w:tblLook w:firstColumn="1" w:firstRow="1" w:lastColumn="0" w:lastRow="0" w:noHBand="0" w:noVBand="1" w:val="04A0"/>
       </w:tblPr>
       <w:tblGrid>
-        <w:gridCol w:w="9648"/>
+        <w:gridCol w:w="9792"/>
       </w:tblGrid>
       <w:tr>
         <w:tc>
           <w:tcPr>
-            <w:tcW w:type="dxa" w:w="9648"/>
-            <w:shd w:fill="F0FDF4"/>
+            <w:tcW w:type="dxa" w:w="9936"/>
+            <w:shd w:fill="F5F3FF"/>
             <w:tcMar>
-              <w:top w:w="100" w:type="dxa"/>
-              <w:bottom w:w="100" w:type="dxa"/>
-              <w:left w:w="150" w:type="dxa"/>
-              <w:right w:w="150" w:type="dxa"/>
+              <w:top w:w="80" w:type="dxa"/>
+              <w:bottom w:w="80" w:type="dxa"/>
+              <w:left w:w="120" w:type="dxa"/>
+              <w:right w:w="120" w:type="dxa"/>
             </w:tcMar>
           </w:tcPr>
           <w:p>
             <w:r>
               <w:rPr>
                 <w:b/>
-                <w:color w:val="166534"/>
+                <w:color w:val="5A1EB4"/>
               </w:rPr>
-              <w:t xml:space="preserve">💡 Архитектурное преимущество: </w:t>
+              <w:t xml:space="preserve">📌 Как проверить: </w:t>
             </w:r>
             <w:r>
               <w:rPr>
-                <w:sz w:val="20"/>
+                <w:sz w:val="19"/>
               </w:rPr>
-              <w:t>Фреймворк Anchor обеспечивает строгую безопасность на уровне типов и генерирует спецификацию интерфейса IDL (Interface Definition Language), позволяющую легко интегрировать фронтенд.</w:t>
+              <w:t>Тесты запускаются командой anchor test (или во вкладке Test в Solana Playground). Клиент запускается из папки client через npm start.</w:t>
             </w:r>
           </w:p>
         </w:tc>
@@ -728,23 +668,15 @@
     </w:p>
     <w:p>
       <w:pPr>
-        <w:spacing w:before="360" w:after="120"/>
+        <w:spacing w:before="320" w:after="80"/>
       </w:pPr>
       <w:r>
         <w:rPr>
           <w:b/>
-          <w:color w:val="9945FF"/>
-          <w:sz w:val="28"/>
+          <w:color w:val="5A1EB4"/>
+          <w:sz w:val="26"/>
         </w:rPr>
-        <w:t xml:space="preserve">РАЗДЕЛ 4 (Неделя 6). </w:t>
-      </w:r>
-      <w:r>
-        <w:rPr>
-          <w:b/>
-          <w:color w:val="181E2A"/>
-          <w:sz w:val="28"/>
-        </w:rPr>
-        <w:t>Accounts, PDAs и архитектура децентрализованного профиля</w:t>
+        <w:t>4. Неделя 6: Аккаунты, PDA и децентрализованный профиль</w:t>
       </w:r>
     </w:p>
     <w:p>
@@ -752,10 +684,10 @@
         <w:rPr>
           <w:b/>
         </w:rPr>
-        <w:t xml:space="preserve">Формулировка задания: </w:t>
+        <w:t xml:space="preserve">Что нужно было сделать: </w:t>
       </w:r>
       <w:r>
-        <w:t>Создать децентрализованный on-chain профиль с использованием PDA.</w:t>
+        <w:t>Создать децентрализованный on-chain профиль пользователя с использованием механизма PDA.</w:t>
       </w:r>
     </w:p>
     <w:p>
@@ -763,18 +695,12 @@
         <w:rPr>
           <w:b/>
         </w:rPr>
-        <w:t xml:space="preserve">Теория Program Derived Address (PDA): </w:t>
+        <w:t>Что такое PDA и как устроен профиль:</w:t>
+        <w:br/>
       </w:r>
       <w:r>
-        <w:t>PDA — это фундаментальная концепция архитектуры Solana. PDA вычисляется математически на основе набора семян (seeds) и ID программы: PublicKey.findProgramAddressSync([b'user-profile', authority.toBuffer()], programId). PDA находится вне эллиптической кривой Ed25519 (off-curve), то есть у него нет приватного ключа. Подписывать транзакции от имени такого адреса имеет право только программа-создатель.</w:t>
-      </w:r>
-    </w:p>
-    <w:p>
-      <w:r>
-        <w:rPr>
-          <w:b/>
-        </w:rPr>
-        <w:t xml:space="preserve">Реализация в проекте (week6_pda_user_profile): </w:t>
+        <w:t>PDA (Program Derived Address) — это одна из главных фишек Solana. Это адрес, который детерминированно вычисляется из строковых сидов и ID программы: seeds = [b'user-profile', wallet_pubkey]. У PDA нет приватного ключа — подписывать за него транзакции может только смарт-контракт. В папке week6_pda_user_profile реализовано:</w:t>
+        <w:br/>
       </w:r>
     </w:p>
     <w:p>
@@ -786,10 +712,10 @@
         <w:rPr>
           <w:b/>
         </w:rPr>
-        <w:t xml:space="preserve">Детерминированная привязка профиля: </w:t>
+        <w:t xml:space="preserve">Гарантия одного профиля: </w:t>
       </w:r>
       <w:r>
-        <w:t>Для каждого кошелька пользователя seeds = [b'user-profile', authority.key().as_ref()] гарантируют существование ровно одного канонического профиля в блокчейне.</w:t>
+        <w:t>Так как адрес PDA привязан к публичному ключу кошелька, один пользователь физически не может наплодить дублирующие профили — адрес всегда один и тот же.</w:t>
       </w:r>
     </w:p>
     <w:p>
@@ -801,10 +727,10 @@
         <w:rPr>
           <w:b/>
         </w:rPr>
-        <w:t xml:space="preserve">Валидация длины данных: </w:t>
+        <w:t xml:space="preserve">Хранилище данных (UserProfile): </w:t>
       </w:r>
       <w:r>
-        <w:t>Строгий контроль размера строк: username до 32 символов, bio до 128 символов, avatar_url до 128 символов. Предотвращает перерасход памяти и DDoS смарт-контракта.</w:t>
+        <w:t>В аккаунте хранятся authority (владелец), username (до 32 символов), bio (до 128 символов) и avatar_url (до 128 символов).</w:t>
       </w:r>
     </w:p>
     <w:p>
@@ -816,10 +742,10 @@
         <w:rPr>
           <w:b/>
         </w:rPr>
-        <w:t xml:space="preserve">Инструкция update_profile: </w:t>
+        <w:t xml:space="preserve">Контроль размера строк: </w:t>
       </w:r>
       <w:r>
-        <w:t>Позволяет изменять биографию и аватар, проверяя, что транзакцию подписал настоящий владелец.</w:t>
+        <w:t>Размеры полей жестко валидируются в контракте через require!, чтобы не допустить раздувания размера аккаунта.</w:t>
       </w:r>
     </w:p>
     <w:p>
@@ -831,10 +757,10 @@
         <w:rPr>
           <w:b/>
         </w:rPr>
-        <w:t xml:space="preserve">Инструкция delete_profile и возврат Rent: </w:t>
+        <w:t xml:space="preserve">Удаление с возвратом депозита (close constraint): </w:t>
       </w:r>
       <w:r>
-        <w:t>Использование констрейнта close = authority. При удалении профиля аккаунт полностью обнуляется в блокчейне, а 100% залога в SOL за аренду памяти (Rent Exemption) возвращаются на баланс пользователя.</w:t>
+        <w:t>В инструкции delete_profile использован констрейнт close = authority. Когда пользователь решает удалить профиль, аккаунт закрывается в блокчейне, а все замороженные за аренду SOL возвращаются обратно на его кошелек.</w:t>
       </w:r>
     </w:p>
     <w:tbl>
@@ -844,33 +770,33 @@
         <w:tblLook w:firstColumn="1" w:firstRow="1" w:lastColumn="0" w:lastRow="0" w:noHBand="0" w:noVBand="1" w:val="04A0"/>
       </w:tblPr>
       <w:tblGrid>
-        <w:gridCol w:w="9648"/>
+        <w:gridCol w:w="9792"/>
       </w:tblGrid>
       <w:tr>
         <w:tc>
           <w:tcPr>
-            <w:tcW w:type="dxa" w:w="9648"/>
-            <w:shd w:fill="F0FDF4"/>
+            <w:tcW w:type="dxa" w:w="9936"/>
+            <w:shd w:fill="F5F3FF"/>
             <w:tcMar>
-              <w:top w:w="100" w:type="dxa"/>
-              <w:bottom w:w="100" w:type="dxa"/>
-              <w:left w:w="150" w:type="dxa"/>
-              <w:right w:w="150" w:type="dxa"/>
+              <w:top w:w="80" w:type="dxa"/>
+              <w:bottom w:w="80" w:type="dxa"/>
+              <w:left w:w="120" w:type="dxa"/>
+              <w:right w:w="120" w:type="dxa"/>
             </w:tcMar>
           </w:tcPr>
           <w:p>
             <w:r>
               <w:rPr>
                 <w:b/>
-                <w:color w:val="166534"/>
+                <w:color w:val="5A1EB4"/>
               </w:rPr>
-              <w:t xml:space="preserve">💡 Ключевая особенность: </w:t>
+              <w:t xml:space="preserve">📌 Как проверить: </w:t>
             </w:r>
             <w:r>
               <w:rPr>
-                <w:sz w:val="20"/>
+                <w:sz w:val="19"/>
               </w:rPr>
-              <w:t>Профиль полностью децентрализован: данные хранятся прямо в распределенном реестре Solana, а механизм close = authority обеспечивает экологичное освобождение неиспользуемого ончейн-пространства с возвратом средств.</w:t>
+              <w:t>Тест tests/user_profile.ts проверяет создание профиля, обновление данных, валидацию длины и факт возврата средств при закрытии аккаунта.</w:t>
             </w:r>
           </w:p>
         </w:tc>
@@ -883,23 +809,15 @@
     </w:p>
     <w:p>
       <w:pPr>
-        <w:spacing w:before="360" w:after="120"/>
+        <w:spacing w:before="320" w:after="80"/>
       </w:pPr>
       <w:r>
         <w:rPr>
           <w:b/>
-          <w:color w:val="9945FF"/>
-          <w:sz w:val="28"/>
+          <w:color w:val="5A1EB4"/>
+          <w:sz w:val="26"/>
         </w:rPr>
-        <w:t xml:space="preserve">РАЗДЕЛ 5 (Неделя 7). </w:t>
-      </w:r>
-      <w:r>
-        <w:rPr>
-          <w:b/>
-          <w:color w:val="181E2A"/>
-          <w:sz w:val="28"/>
-        </w:rPr>
-        <w:t>SPL Tokens и Token Extensions (Выпуск, Transfer, Метаданные)</w:t>
+        <w:t>5. Неделя 7: SPL Tokens (Выпуск, Transfer, Метаданные)</w:t>
       </w:r>
     </w:p>
     <w:p>
@@ -907,10 +825,10 @@
         <w:rPr>
           <w:b/>
         </w:rPr>
-        <w:t xml:space="preserve">Формулировка задания: </w:t>
+        <w:t xml:space="preserve">Что нужно было сделать: </w:t>
       </w:r>
       <w:r>
-        <w:t>Создать собственный токен: выпуск, transfer, metadata и взаимодействие через client.</w:t>
+        <w:t>Создать собственный токен: выпуск, transfer, metadata и взаимодействие через клиент.</w:t>
       </w:r>
     </w:p>
     <w:p>
@@ -918,10 +836,15 @@
         <w:rPr>
           <w:b/>
         </w:rPr>
-        <w:t xml:space="preserve">Архитектура токенов в Solana: </w:t>
+        <w:t>Как работают токены в Solana:</w:t>
+        <w:br/>
       </w:r>
       <w:r>
-        <w:t>В отличие от Ethereum (где под каждый токен пишется отдельный смарт-контракт ERC-20), в Solana функционирует единая глобальная программа SPL Token Program (TokenkegQfeZyiNwAJbNbGKPFXCWuBvf9Ss623VQ5DA). Пользователи создают:</w:t>
+        <w:t>В Ethereum под каждый новый токен деплоят отдельный контракт стандарта ERC-20. В Solana все устроено гораздо быстрее и экономнее: в сети уже работает системная программа SPL Token Program. Мы создаем Mint-аккаунт (параметры самого токена) и ATA (Associated Token Account) — персональные хранилища токена для каждого конкретного пользователя.</w:t>
+        <w:br/>
+        <w:br/>
+        <w:t>В папке week7_spl_tokens подготовлен скрипт, автоматизирующий весь процесс в Devnet:</w:t>
+        <w:br/>
       </w:r>
     </w:p>
     <w:p>
@@ -933,10 +856,10 @@
         <w:rPr>
           <w:b/>
         </w:rPr>
-        <w:t xml:space="preserve">Mint Account: </w:t>
+        <w:t xml:space="preserve">1. Создание токена (01_create_mint.ts): </w:t>
       </w:r>
       <w:r>
-        <w:t>Аккаунт самого токена, хранящий общую эмиссию (Supply), точность (Decimals = 9), а также права на выпуск (mintAuthority) и заморозку (freezeAuthority).</w:t>
+        <w:t>Создание Mint аккаунта с точностью 9 десятичных знаков (decimals = 9).</w:t>
       </w:r>
     </w:p>
     <w:p>
@@ -948,10 +871,10 @@
         <w:rPr>
           <w:b/>
         </w:rPr>
-        <w:t xml:space="preserve">Associated Token Account (ATA): </w:t>
+        <w:t xml:space="preserve">2. Метаданные Metaplex (02_create_metadata.ts): </w:t>
       </w:r>
       <w:r>
-        <w:t>Детерминированное хранилище токенов для конкретного пользователя, вычисляемое как PDA от адреса кошелька и адреса токена.</w:t>
+        <w:t>Привязка официальных метаданных по стандарту Metaplex Token Metadata V3: название 'Startup University Token', символ 'STARTUP' и ссылка на логотип.</w:t>
       </w:r>
     </w:p>
     <w:p>
@@ -963,21 +886,10 @@
         <w:rPr>
           <w:b/>
         </w:rPr>
-        <w:t xml:space="preserve">Metaplex Metadata Program: </w:t>
+        <w:t xml:space="preserve">3. Чеканка токенов (03_mint_tokens.ts): </w:t>
       </w:r>
       <w:r>
-        <w:t>Официальный стандарт добавления названия, тикера и ссылки на JSON-описание токена через программу metaqbxxUerdq28cj1RbAWkYQm3ybzjb6a8bt518x1s.</w:t>
-      </w:r>
-    </w:p>
-    <w:p>
-      <w:r>
-        <w:rPr>
-          <w:b/>
-        </w:rPr>
-        <w:t xml:space="preserve">Сквозной автоматизированный пайплайн (week7_spl_tokens): </w:t>
-      </w:r>
-      <w:r>
-        <w:t>В проекте разработаны как отдельные скрипты под каждый шаг, так и комплексный оркестратор src/run_all.ts:</w:t>
+        <w:t>Создание связанного токен-аккаунта (ATA) для кошелька создателя и чеканка 50 000 токенов (MintTo).</w:t>
       </w:r>
     </w:p>
     <w:p>
@@ -989,10 +901,10 @@
         <w:rPr>
           <w:b/>
         </w:rPr>
-        <w:t xml:space="preserve">1. 01_create_mint.ts: </w:t>
+        <w:t xml:space="preserve">4. Перевод другому владельцу (04_transfer_tokens.ts): </w:t>
       </w:r>
       <w:r>
-        <w:t>Создание аккаунта токена в сети Devnet.</w:t>
+        <w:t>Генерация второго кошелька (Bob), создание его ATA и перевод 1 500 токенов с подтверждением транзакции.</w:t>
       </w:r>
     </w:p>
     <w:p>
@@ -1004,55 +916,10 @@
         <w:rPr>
           <w:b/>
         </w:rPr>
-        <w:t xml:space="preserve">2. 02_create_metadata.ts: </w:t>
+        <w:t xml:space="preserve">5. Проверка балансов (05_check_balances.ts): </w:t>
       </w:r>
       <w:r>
-        <w:t>Прикрепление метаданных Metaplex V3 (Имя: 'Startup University Token', Символ: 'STARTUP').</w:t>
-      </w:r>
-    </w:p>
-    <w:p>
-      <w:pPr>
-        <w:pStyle w:val="ListBullet"/>
-        <w:spacing w:after="40"/>
-      </w:pPr>
-      <w:r>
-        <w:rPr>
-          <w:b/>
-        </w:rPr>
-        <w:t xml:space="preserve">3. 03_mint_tokens.ts: </w:t>
-      </w:r>
-      <w:r>
-        <w:t>Автоматическое создание ATA для создателя и чеканка 50,000 токенов (MintTo).</w:t>
-      </w:r>
-    </w:p>
-    <w:p>
-      <w:pPr>
-        <w:pStyle w:val="ListBullet"/>
-        <w:spacing w:after="40"/>
-      </w:pPr>
-      <w:r>
-        <w:rPr>
-          <w:b/>
-        </w:rPr>
-        <w:t xml:space="preserve">4. 04_transfer_tokens.ts: </w:t>
-      </w:r>
-      <w:r>
-        <w:t>Создание кошелька получателя, аллокация его ATA и безопасный перевод 1,500 токенов.</w:t>
-      </w:r>
-    </w:p>
-    <w:p>
-      <w:pPr>
-        <w:pStyle w:val="ListBullet"/>
-        <w:spacing w:after="40"/>
-      </w:pPr>
-      <w:r>
-        <w:rPr>
-          <w:b/>
-        </w:rPr>
-        <w:t xml:space="preserve">5. 05_check_balances.ts: </w:t>
-      </w:r>
-      <w:r>
-        <w:t>Ончейн-аудит состояния токена, проверка Supply и остатков на кошельках.</w:t>
+        <w:t>Чтение финального состояния токена из блокчейна: общий объем предложения (Total Supply) и остатки на кошельках.</w:t>
       </w:r>
     </w:p>
     <w:tbl>
@@ -1062,33 +929,33 @@
         <w:tblLook w:firstColumn="1" w:firstRow="1" w:lastColumn="0" w:lastRow="0" w:noHBand="0" w:noVBand="1" w:val="04A0"/>
       </w:tblPr>
       <w:tblGrid>
-        <w:gridCol w:w="9648"/>
+        <w:gridCol w:w="9792"/>
       </w:tblGrid>
       <w:tr>
         <w:tc>
           <w:tcPr>
-            <w:tcW w:type="dxa" w:w="9648"/>
-            <w:shd w:fill="F0FDF4"/>
+            <w:tcW w:type="dxa" w:w="9936"/>
+            <w:shd w:fill="F5F3FF"/>
             <w:tcMar>
-              <w:top w:w="100" w:type="dxa"/>
-              <w:bottom w:w="100" w:type="dxa"/>
-              <w:left w:w="150" w:type="dxa"/>
-              <w:right w:w="150" w:type="dxa"/>
+              <w:top w:w="80" w:type="dxa"/>
+              <w:bottom w:w="80" w:type="dxa"/>
+              <w:left w:w="120" w:type="dxa"/>
+              <w:right w:w="120" w:type="dxa"/>
             </w:tcMar>
           </w:tcPr>
           <w:p>
             <w:r>
               <w:rPr>
                 <w:b/>
-                <w:color w:val="166534"/>
+                <w:color w:val="5A1EB4"/>
               </w:rPr>
-              <w:t xml:space="preserve">💡 Результат проверки: </w:t>
+              <w:t xml:space="preserve">📌 Как проверить: </w:t>
             </w:r>
             <w:r>
               <w:rPr>
-                <w:sz w:val="20"/>
+                <w:sz w:val="19"/>
               </w:rPr>
-              <w:t>Полный цикл запускается командой 'npm start' в папке week7_spl_tokens. Все транзакции фиксируются в распределенном реестре Devnet и доступны для аудита преподавателем в Solana Explorer.</w:t>
+              <w:t>Сквозной запуск всего цикла: перейти в week7_spl_tokens и выполнить npm start. Скрипт сам запросит аирдроп SOL, создаст токен, отчеканит монеты, переведет часть на второй адрес и выведет ссылки на транзакции в Solana Explorer.</w:t>
             </w:r>
           </w:p>
         </w:tc>
@@ -1101,42 +968,39 @@
     </w:p>
     <w:p>
       <w:pPr>
-        <w:spacing w:before="300"/>
+        <w:spacing w:before="320" w:after="80"/>
       </w:pPr>
-    </w:p>
-    <w:p>
       <w:r>
         <w:rPr>
           <w:b/>
-          <w:color w:val="9945FF"/>
+          <w:color w:val="5A1EB4"/>
           <w:sz w:val="26"/>
         </w:rPr>
-        <w:t>Сводная таблица готовности заданий к сдаче</w:t>
+        <w:t>6. Сводная таблица по всем заданиям</w:t>
       </w:r>
     </w:p>
     <w:tbl>
       <w:tblPr>
         <w:tblW w:type="auto" w:w="0"/>
         <w:jc w:val="center"/>
-        <w:tblLayout w:type="fixed"/>
         <w:tblLook w:firstColumn="1" w:firstRow="1" w:lastColumn="0" w:lastRow="0" w:noHBand="0" w:noVBand="1" w:val="04A0"/>
       </w:tblPr>
       <w:tblGrid>
-        <w:gridCol w:w="1152"/>
+        <w:gridCol w:w="1296"/>
         <w:gridCol w:w="2592"/>
-        <w:gridCol w:w="3888"/>
-        <w:gridCol w:w="2016"/>
+        <w:gridCol w:w="4320"/>
+        <w:gridCol w:w="1728"/>
       </w:tblGrid>
       <w:tr>
         <w:tc>
           <w:tcPr>
-            <w:tcW w:type="dxa" w:w="2412"/>
-            <w:shd w:fill="9945FF"/>
+            <w:tcW w:type="dxa" w:w="2448"/>
+            <w:shd w:fill="5A1EB4"/>
             <w:tcMar>
-              <w:top w:w="100" w:type="dxa"/>
-              <w:bottom w:w="100" w:type="dxa"/>
-              <w:left w:w="100" w:type="dxa"/>
-              <w:right w:w="100" w:type="dxa"/>
+              <w:top w:w="80" w:type="dxa"/>
+              <w:bottom w:w="80" w:type="dxa"/>
+              <w:left w:w="80" w:type="dxa"/>
+              <w:right w:w="80" w:type="dxa"/>
             </w:tcMar>
           </w:tcPr>
           <w:p>
@@ -1144,7 +1008,7 @@
               <w:rPr>
                 <w:b/>
                 <w:color w:val="FFFFFF"/>
-                <w:sz w:val="20"/>
+                <w:sz w:val="19"/>
               </w:rPr>
               <w:t>Неделя</w:t>
             </w:r>
@@ -1152,13 +1016,13 @@
         </w:tc>
         <w:tc>
           <w:tcPr>
-            <w:tcW w:type="dxa" w:w="2412"/>
-            <w:shd w:fill="9945FF"/>
+            <w:tcW w:type="dxa" w:w="2448"/>
+            <w:shd w:fill="5A1EB4"/>
             <w:tcMar>
-              <w:top w:w="100" w:type="dxa"/>
-              <w:bottom w:w="100" w:type="dxa"/>
-              <w:left w:w="100" w:type="dxa"/>
-              <w:right w:w="100" w:type="dxa"/>
+              <w:top w:w="80" w:type="dxa"/>
+              <w:bottom w:w="80" w:type="dxa"/>
+              <w:left w:w="80" w:type="dxa"/>
+              <w:right w:w="80" w:type="dxa"/>
             </w:tcMar>
           </w:tcPr>
           <w:p>
@@ -1166,7 +1030,7 @@
               <w:rPr>
                 <w:b/>
                 <w:color w:val="FFFFFF"/>
-                <w:sz w:val="20"/>
+                <w:sz w:val="19"/>
               </w:rPr>
               <w:t>Тема</w:t>
             </w:r>
@@ -1174,13 +1038,13 @@
         </w:tc>
         <w:tc>
           <w:tcPr>
-            <w:tcW w:type="dxa" w:w="2412"/>
-            <w:shd w:fill="9945FF"/>
+            <w:tcW w:type="dxa" w:w="2448"/>
+            <w:shd w:fill="5A1EB4"/>
             <w:tcMar>
-              <w:top w:w="100" w:type="dxa"/>
-              <w:bottom w:w="100" w:type="dxa"/>
-              <w:left w:w="100" w:type="dxa"/>
-              <w:right w:w="100" w:type="dxa"/>
+              <w:top w:w="80" w:type="dxa"/>
+              <w:bottom w:w="80" w:type="dxa"/>
+              <w:left w:w="80" w:type="dxa"/>
+              <w:right w:w="80" w:type="dxa"/>
             </w:tcMar>
           </w:tcPr>
           <w:p>
@@ -1188,21 +1052,21 @@
               <w:rPr>
                 <w:b/>
                 <w:color w:val="FFFFFF"/>
-                <w:sz w:val="20"/>
+                <w:sz w:val="19"/>
               </w:rPr>
-              <w:t>Результат разработки</w:t>
+              <w:t>Что разработано</w:t>
             </w:r>
           </w:p>
         </w:tc>
         <w:tc>
           <w:tcPr>
-            <w:tcW w:type="dxa" w:w="2412"/>
-            <w:shd w:fill="9945FF"/>
+            <w:tcW w:type="dxa" w:w="2448"/>
+            <w:shd w:fill="5A1EB4"/>
             <w:tcMar>
-              <w:top w:w="100" w:type="dxa"/>
-              <w:bottom w:w="100" w:type="dxa"/>
-              <w:left w:w="100" w:type="dxa"/>
-              <w:right w:w="100" w:type="dxa"/>
+              <w:top w:w="80" w:type="dxa"/>
+              <w:bottom w:w="80" w:type="dxa"/>
+              <w:left w:w="80" w:type="dxa"/>
+              <w:right w:w="80" w:type="dxa"/>
             </w:tcMar>
           </w:tcPr>
           <w:p>
@@ -1210,9 +1074,9 @@
               <w:rPr>
                 <w:b/>
                 <w:color w:val="FFFFFF"/>
-                <w:sz w:val="20"/>
+                <w:sz w:val="19"/>
               </w:rPr>
-              <w:t>Статус</w:t>
+              <w:t>Готовность</w:t>
             </w:r>
           </w:p>
         </w:tc>
@@ -1220,19 +1084,19 @@
       <w:tr>
         <w:tc>
           <w:tcPr>
-            <w:tcW w:type="dxa" w:w="2412"/>
+            <w:tcW w:type="dxa" w:w="2448"/>
             <w:shd w:fill="FFFFFF"/>
             <w:tcMar>
-              <w:top w:w="70" w:type="dxa"/>
-              <w:bottom w:w="70" w:type="dxa"/>
-              <w:left w:w="100" w:type="dxa"/>
-              <w:right w:w="100" w:type="dxa"/>
+              <w:top w:w="60" w:type="dxa"/>
+              <w:bottom w:w="60" w:type="dxa"/>
+              <w:left w:w="80" w:type="dxa"/>
+              <w:right w:w="80" w:type="dxa"/>
             </w:tcMar>
           </w:tcPr>
           <w:p>
             <w:r>
               <w:rPr>
-                <w:sz w:val="19"/>
+                <w:sz w:val="18"/>
               </w:rPr>
               <w:t>Неделя 3</w:t>
             </w:r>
@@ -1240,19 +1104,19 @@
         </w:tc>
         <w:tc>
           <w:tcPr>
-            <w:tcW w:type="dxa" w:w="2412"/>
+            <w:tcW w:type="dxa" w:w="2448"/>
             <w:shd w:fill="FFFFFF"/>
             <w:tcMar>
-              <w:top w:w="70" w:type="dxa"/>
-              <w:bottom w:w="70" w:type="dxa"/>
-              <w:left w:w="100" w:type="dxa"/>
-              <w:right w:w="100" w:type="dxa"/>
+              <w:top w:w="60" w:type="dxa"/>
+              <w:bottom w:w="60" w:type="dxa"/>
+              <w:left w:w="80" w:type="dxa"/>
+              <w:right w:w="80" w:type="dxa"/>
             </w:tcMar>
           </w:tcPr>
           <w:p>
             <w:r>
               <w:rPr>
-                <w:sz w:val="19"/>
+                <w:sz w:val="18"/>
               </w:rPr>
               <w:t>Rust для Solana</w:t>
             </w:r>
@@ -1260,33 +1124,33 @@
         </w:tc>
         <w:tc>
           <w:tcPr>
-            <w:tcW w:type="dxa" w:w="2412"/>
+            <w:tcW w:type="dxa" w:w="2448"/>
             <w:shd w:fill="FFFFFF"/>
             <w:tcMar>
-              <w:top w:w="70" w:type="dxa"/>
-              <w:bottom w:w="70" w:type="dxa"/>
-              <w:left w:w="100" w:type="dxa"/>
-              <w:right w:w="100" w:type="dxa"/>
+              <w:top w:w="60" w:type="dxa"/>
+              <w:bottom w:w="60" w:type="dxa"/>
+              <w:left w:w="80" w:type="dxa"/>
+              <w:right w:w="80" w:type="dxa"/>
             </w:tcMar>
           </w:tcPr>
           <w:p>
             <w:r>
               <w:rPr>
-                <w:sz w:val="19"/>
+                <w:sz w:val="18"/>
               </w:rPr>
-              <w:t>CLI эмулятор SVM, Borsh, Account model</w:t>
+              <w:t>CLI эмулятор рантайма, Borsh, Account model</w:t>
             </w:r>
           </w:p>
         </w:tc>
         <w:tc>
           <w:tcPr>
-            <w:tcW w:type="dxa" w:w="2412"/>
+            <w:tcW w:type="dxa" w:w="2448"/>
             <w:shd w:fill="FFFFFF"/>
             <w:tcMar>
-              <w:top w:w="70" w:type="dxa"/>
-              <w:bottom w:w="70" w:type="dxa"/>
-              <w:left w:w="100" w:type="dxa"/>
-              <w:right w:w="100" w:type="dxa"/>
+              <w:top w:w="60" w:type="dxa"/>
+              <w:bottom w:w="60" w:type="dxa"/>
+              <w:left w:w="80" w:type="dxa"/>
+              <w:right w:w="80" w:type="dxa"/>
             </w:tcMar>
           </w:tcPr>
           <w:p>
@@ -1294,9 +1158,9 @@
               <w:rPr>
                 <w:b/>
                 <w:color w:val="166534"/>
-                <w:sz w:val="19"/>
+                <w:sz w:val="18"/>
               </w:rPr>
-              <w:t>Выполнено ✅</w:t>
+              <w:t>Готово ✅</w:t>
             </w:r>
           </w:p>
         </w:tc>
@@ -1304,19 +1168,19 @@
       <w:tr>
         <w:tc>
           <w:tcPr>
-            <w:tcW w:type="dxa" w:w="2412"/>
+            <w:tcW w:type="dxa" w:w="2448"/>
             <w:shd w:fill="F9FAFB"/>
             <w:tcMar>
-              <w:top w:w="70" w:type="dxa"/>
-              <w:bottom w:w="70" w:type="dxa"/>
-              <w:left w:w="100" w:type="dxa"/>
-              <w:right w:w="100" w:type="dxa"/>
+              <w:top w:w="60" w:type="dxa"/>
+              <w:bottom w:w="60" w:type="dxa"/>
+              <w:left w:w="80" w:type="dxa"/>
+              <w:right w:w="80" w:type="dxa"/>
             </w:tcMar>
           </w:tcPr>
           <w:p>
             <w:r>
               <w:rPr>
-                <w:sz w:val="19"/>
+                <w:sz w:val="18"/>
               </w:rPr>
               <w:t>Неделя 4</w:t>
             </w:r>
@@ -1324,53 +1188,53 @@
         </w:tc>
         <w:tc>
           <w:tcPr>
-            <w:tcW w:type="dxa" w:w="2412"/>
+            <w:tcW w:type="dxa" w:w="2448"/>
             <w:shd w:fill="F9FAFB"/>
             <w:tcMar>
-              <w:top w:w="70" w:type="dxa"/>
-              <w:bottom w:w="70" w:type="dxa"/>
-              <w:left w:w="100" w:type="dxa"/>
-              <w:right w:w="100" w:type="dxa"/>
+              <w:top w:w="60" w:type="dxa"/>
+              <w:bottom w:w="60" w:type="dxa"/>
+              <w:left w:w="80" w:type="dxa"/>
+              <w:right w:w="80" w:type="dxa"/>
             </w:tcMar>
           </w:tcPr>
           <w:p>
             <w:r>
               <w:rPr>
-                <w:sz w:val="19"/>
+                <w:sz w:val="18"/>
               </w:rPr>
-              <w:t>Первая Solana Program</w:t>
+              <w:t>Первая программа</w:t>
             </w:r>
           </w:p>
         </w:tc>
         <w:tc>
           <w:tcPr>
-            <w:tcW w:type="dxa" w:w="2412"/>
+            <w:tcW w:type="dxa" w:w="2448"/>
             <w:shd w:fill="F9FAFB"/>
             <w:tcMar>
-              <w:top w:w="70" w:type="dxa"/>
-              <w:bottom w:w="70" w:type="dxa"/>
-              <w:left w:w="100" w:type="dxa"/>
-              <w:right w:w="100" w:type="dxa"/>
+              <w:top w:w="60" w:type="dxa"/>
+              <w:bottom w:w="60" w:type="dxa"/>
+              <w:left w:w="80" w:type="dxa"/>
+              <w:right w:w="80" w:type="dxa"/>
             </w:tcMar>
           </w:tcPr>
           <w:p>
             <w:r>
               <w:rPr>
-                <w:sz w:val="19"/>
+                <w:sz w:val="18"/>
               </w:rPr>
-              <w:t>Нативный контракт, Devnet deploy, web3 client</w:t>
+              <w:t>Нативный смарт-контракт, Devnet деплой, клиент web3.js</w:t>
             </w:r>
           </w:p>
         </w:tc>
         <w:tc>
           <w:tcPr>
-            <w:tcW w:type="dxa" w:w="2412"/>
+            <w:tcW w:type="dxa" w:w="2448"/>
             <w:shd w:fill="F9FAFB"/>
             <w:tcMar>
-              <w:top w:w="70" w:type="dxa"/>
-              <w:bottom w:w="70" w:type="dxa"/>
-              <w:left w:w="100" w:type="dxa"/>
-              <w:right w:w="100" w:type="dxa"/>
+              <w:top w:w="60" w:type="dxa"/>
+              <w:bottom w:w="60" w:type="dxa"/>
+              <w:left w:w="80" w:type="dxa"/>
+              <w:right w:w="80" w:type="dxa"/>
             </w:tcMar>
           </w:tcPr>
           <w:p>
@@ -1378,9 +1242,9 @@
               <w:rPr>
                 <w:b/>
                 <w:color w:val="166534"/>
-                <w:sz w:val="19"/>
+                <w:sz w:val="18"/>
               </w:rPr>
-              <w:t>Выполнено ✅</w:t>
+              <w:t>Готово ✅</w:t>
             </w:r>
           </w:p>
         </w:tc>
@@ -1388,19 +1252,19 @@
       <w:tr>
         <w:tc>
           <w:tcPr>
-            <w:tcW w:type="dxa" w:w="2412"/>
+            <w:tcW w:type="dxa" w:w="2448"/>
             <w:shd w:fill="FFFFFF"/>
             <w:tcMar>
-              <w:top w:w="70" w:type="dxa"/>
-              <w:bottom w:w="70" w:type="dxa"/>
-              <w:left w:w="100" w:type="dxa"/>
-              <w:right w:w="100" w:type="dxa"/>
+              <w:top w:w="60" w:type="dxa"/>
+              <w:bottom w:w="60" w:type="dxa"/>
+              <w:left w:w="80" w:type="dxa"/>
+              <w:right w:w="80" w:type="dxa"/>
             </w:tcMar>
           </w:tcPr>
           <w:p>
             <w:r>
               <w:rPr>
-                <w:sz w:val="19"/>
+                <w:sz w:val="18"/>
               </w:rPr>
               <w:t>Неделя 5</w:t>
             </w:r>
@@ -1408,19 +1272,19 @@
         </w:tc>
         <w:tc>
           <w:tcPr>
-            <w:tcW w:type="dxa" w:w="2412"/>
+            <w:tcW w:type="dxa" w:w="2448"/>
             <w:shd w:fill="FFFFFF"/>
             <w:tcMar>
-              <w:top w:w="70" w:type="dxa"/>
-              <w:bottom w:w="70" w:type="dxa"/>
-              <w:left w:w="100" w:type="dxa"/>
-              <w:right w:w="100" w:type="dxa"/>
+              <w:top w:w="60" w:type="dxa"/>
+              <w:bottom w:w="60" w:type="dxa"/>
+              <w:left w:w="80" w:type="dxa"/>
+              <w:right w:w="80" w:type="dxa"/>
             </w:tcMar>
           </w:tcPr>
           <w:p>
             <w:r>
               <w:rPr>
-                <w:sz w:val="19"/>
+                <w:sz w:val="18"/>
               </w:rPr>
               <w:t>Anchor Framework</w:t>
             </w:r>
@@ -1428,33 +1292,33 @@
         </w:tc>
         <w:tc>
           <w:tcPr>
-            <w:tcW w:type="dxa" w:w="2412"/>
+            <w:tcW w:type="dxa" w:w="2448"/>
             <w:shd w:fill="FFFFFF"/>
             <w:tcMar>
-              <w:top w:w="70" w:type="dxa"/>
-              <w:bottom w:w="70" w:type="dxa"/>
-              <w:left w:w="100" w:type="dxa"/>
-              <w:right w:w="100" w:type="dxa"/>
+              <w:top w:w="60" w:type="dxa"/>
+              <w:bottom w:w="60" w:type="dxa"/>
+              <w:left w:w="80" w:type="dxa"/>
+              <w:right w:w="80" w:type="dxa"/>
             </w:tcMar>
           </w:tcPr>
           <w:p>
             <w:r>
               <w:rPr>
-                <w:sz w:val="19"/>
+                <w:sz w:val="18"/>
               </w:rPr>
-              <w:t>Counter Program, Underflow check, Mocha tests</w:t>
+              <w:t>Counter Program, Underflow require, тесты Mocha/Chai</w:t>
             </w:r>
           </w:p>
         </w:tc>
         <w:tc>
           <w:tcPr>
-            <w:tcW w:type="dxa" w:w="2412"/>
+            <w:tcW w:type="dxa" w:w="2448"/>
             <w:shd w:fill="FFFFFF"/>
             <w:tcMar>
-              <w:top w:w="70" w:type="dxa"/>
-              <w:bottom w:w="70" w:type="dxa"/>
-              <w:left w:w="100" w:type="dxa"/>
-              <w:right w:w="100" w:type="dxa"/>
+              <w:top w:w="60" w:type="dxa"/>
+              <w:bottom w:w="60" w:type="dxa"/>
+              <w:left w:w="80" w:type="dxa"/>
+              <w:right w:w="80" w:type="dxa"/>
             </w:tcMar>
           </w:tcPr>
           <w:p>
@@ -1462,9 +1326,9 @@
               <w:rPr>
                 <w:b/>
                 <w:color w:val="166534"/>
-                <w:sz w:val="19"/>
+                <w:sz w:val="18"/>
               </w:rPr>
-              <w:t>Выполнено ✅</w:t>
+              <w:t>Готово ✅</w:t>
             </w:r>
           </w:p>
         </w:tc>
@@ -1472,19 +1336,19 @@
       <w:tr>
         <w:tc>
           <w:tcPr>
-            <w:tcW w:type="dxa" w:w="2412"/>
+            <w:tcW w:type="dxa" w:w="2448"/>
             <w:shd w:fill="F9FAFB"/>
             <w:tcMar>
-              <w:top w:w="70" w:type="dxa"/>
-              <w:bottom w:w="70" w:type="dxa"/>
-              <w:left w:w="100" w:type="dxa"/>
-              <w:right w:w="100" w:type="dxa"/>
+              <w:top w:w="60" w:type="dxa"/>
+              <w:bottom w:w="60" w:type="dxa"/>
+              <w:left w:w="80" w:type="dxa"/>
+              <w:right w:w="80" w:type="dxa"/>
             </w:tcMar>
           </w:tcPr>
           <w:p>
             <w:r>
               <w:rPr>
-                <w:sz w:val="19"/>
+                <w:sz w:val="18"/>
               </w:rPr>
               <w:t>Неделя 6</w:t>
             </w:r>
@@ -1492,53 +1356,53 @@
         </w:tc>
         <w:tc>
           <w:tcPr>
-            <w:tcW w:type="dxa" w:w="2412"/>
+            <w:tcW w:type="dxa" w:w="2448"/>
             <w:shd w:fill="F9FAFB"/>
             <w:tcMar>
-              <w:top w:w="70" w:type="dxa"/>
-              <w:bottom w:w="70" w:type="dxa"/>
-              <w:left w:w="100" w:type="dxa"/>
-              <w:right w:w="100" w:type="dxa"/>
+              <w:top w:w="60" w:type="dxa"/>
+              <w:bottom w:w="60" w:type="dxa"/>
+              <w:left w:w="80" w:type="dxa"/>
+              <w:right w:w="80" w:type="dxa"/>
             </w:tcMar>
           </w:tcPr>
           <w:p>
             <w:r>
               <w:rPr>
-                <w:sz w:val="19"/>
+                <w:sz w:val="18"/>
               </w:rPr>
-              <w:t>PDAs &amp; Архитектура</w:t>
+              <w:t>PDA и архитектура</w:t>
             </w:r>
           </w:p>
         </w:tc>
         <w:tc>
           <w:tcPr>
-            <w:tcW w:type="dxa" w:w="2412"/>
+            <w:tcW w:type="dxa" w:w="2448"/>
             <w:shd w:fill="F9FAFB"/>
             <w:tcMar>
-              <w:top w:w="70" w:type="dxa"/>
-              <w:bottom w:w="70" w:type="dxa"/>
-              <w:left w:w="100" w:type="dxa"/>
-              <w:right w:w="100" w:type="dxa"/>
+              <w:top w:w="60" w:type="dxa"/>
+              <w:bottom w:w="60" w:type="dxa"/>
+              <w:left w:w="80" w:type="dxa"/>
+              <w:right w:w="80" w:type="dxa"/>
             </w:tcMar>
           </w:tcPr>
           <w:p>
             <w:r>
               <w:rPr>
-                <w:sz w:val="19"/>
+                <w:sz w:val="18"/>
               </w:rPr>
-              <w:t>Децентрализованный профиль, Rent refund (close)</w:t>
+              <w:t>Децентрализованный профиль, возврат рента через close</w:t>
             </w:r>
           </w:p>
         </w:tc>
         <w:tc>
           <w:tcPr>
-            <w:tcW w:type="dxa" w:w="2412"/>
+            <w:tcW w:type="dxa" w:w="2448"/>
             <w:shd w:fill="F9FAFB"/>
             <w:tcMar>
-              <w:top w:w="70" w:type="dxa"/>
-              <w:bottom w:w="70" w:type="dxa"/>
-              <w:left w:w="100" w:type="dxa"/>
-              <w:right w:w="100" w:type="dxa"/>
+              <w:top w:w="60" w:type="dxa"/>
+              <w:bottom w:w="60" w:type="dxa"/>
+              <w:left w:w="80" w:type="dxa"/>
+              <w:right w:w="80" w:type="dxa"/>
             </w:tcMar>
           </w:tcPr>
           <w:p>
@@ -1546,9 +1410,9 @@
               <w:rPr>
                 <w:b/>
                 <w:color w:val="166534"/>
-                <w:sz w:val="19"/>
+                <w:sz w:val="18"/>
               </w:rPr>
-              <w:t>Выполнено ✅</w:t>
+              <w:t>Готово ✅</w:t>
             </w:r>
           </w:p>
         </w:tc>
@@ -1556,19 +1420,19 @@
       <w:tr>
         <w:tc>
           <w:tcPr>
-            <w:tcW w:type="dxa" w:w="2412"/>
+            <w:tcW w:type="dxa" w:w="2448"/>
             <w:shd w:fill="FFFFFF"/>
             <w:tcMar>
-              <w:top w:w="70" w:type="dxa"/>
-              <w:bottom w:w="70" w:type="dxa"/>
-              <w:left w:w="100" w:type="dxa"/>
-              <w:right w:w="100" w:type="dxa"/>
+              <w:top w:w="60" w:type="dxa"/>
+              <w:bottom w:w="60" w:type="dxa"/>
+              <w:left w:w="80" w:type="dxa"/>
+              <w:right w:w="80" w:type="dxa"/>
             </w:tcMar>
           </w:tcPr>
           <w:p>
             <w:r>
               <w:rPr>
-                <w:sz w:val="19"/>
+                <w:sz w:val="18"/>
               </w:rPr>
               <w:t>Неделя 7</w:t>
             </w:r>
@@ -1576,53 +1440,53 @@
         </w:tc>
         <w:tc>
           <w:tcPr>
-            <w:tcW w:type="dxa" w:w="2412"/>
+            <w:tcW w:type="dxa" w:w="2448"/>
             <w:shd w:fill="FFFFFF"/>
             <w:tcMar>
-              <w:top w:w="70" w:type="dxa"/>
-              <w:bottom w:w="70" w:type="dxa"/>
-              <w:left w:w="100" w:type="dxa"/>
-              <w:right w:w="100" w:type="dxa"/>
+              <w:top w:w="60" w:type="dxa"/>
+              <w:bottom w:w="60" w:type="dxa"/>
+              <w:left w:w="80" w:type="dxa"/>
+              <w:right w:w="80" w:type="dxa"/>
             </w:tcMar>
           </w:tcPr>
           <w:p>
             <w:r>
               <w:rPr>
-                <w:sz w:val="19"/>
+                <w:sz w:val="18"/>
               </w:rPr>
-              <w:t>SPL Tokens &amp; Extensions</w:t>
+              <w:t>SPL Токены</w:t>
             </w:r>
           </w:p>
         </w:tc>
         <w:tc>
           <w:tcPr>
-            <w:tcW w:type="dxa" w:w="2412"/>
+            <w:tcW w:type="dxa" w:w="2448"/>
             <w:shd w:fill="FFFFFF"/>
             <w:tcMar>
-              <w:top w:w="70" w:type="dxa"/>
-              <w:bottom w:w="70" w:type="dxa"/>
-              <w:left w:w="100" w:type="dxa"/>
-              <w:right w:w="100" w:type="dxa"/>
+              <w:top w:w="60" w:type="dxa"/>
+              <w:bottom w:w="60" w:type="dxa"/>
+              <w:left w:w="80" w:type="dxa"/>
+              <w:right w:w="80" w:type="dxa"/>
             </w:tcMar>
           </w:tcPr>
           <w:p>
             <w:r>
               <w:rPr>
-                <w:sz w:val="19"/>
+                <w:sz w:val="18"/>
               </w:rPr>
-              <w:t>Выпуск токена, Metaplex V3, MintTo, Transfer</w:t>
+              <w:t>Скрипты создания минта, Metaplex V3, чеканка, трансфер</w:t>
             </w:r>
           </w:p>
         </w:tc>
         <w:tc>
           <w:tcPr>
-            <w:tcW w:type="dxa" w:w="2412"/>
+            <w:tcW w:type="dxa" w:w="2448"/>
             <w:shd w:fill="FFFFFF"/>
             <w:tcMar>
-              <w:top w:w="70" w:type="dxa"/>
-              <w:bottom w:w="70" w:type="dxa"/>
-              <w:left w:w="100" w:type="dxa"/>
-              <w:right w:w="100" w:type="dxa"/>
+              <w:top w:w="60" w:type="dxa"/>
+              <w:bottom w:w="60" w:type="dxa"/>
+              <w:left w:w="80" w:type="dxa"/>
+              <w:right w:w="80" w:type="dxa"/>
             </w:tcMar>
           </w:tcPr>
           <w:p>
@@ -1630,83 +1494,17 @@
               <w:rPr>
                 <w:b/>
                 <w:color w:val="166534"/>
-                <w:sz w:val="19"/>
+                <w:sz w:val="18"/>
               </w:rPr>
-              <w:t>Выполнено ✅</w:t>
+              <w:t>Готово ✅</w:t>
             </w:r>
           </w:p>
         </w:tc>
       </w:tr>
     </w:tbl>
-    <w:p>
-      <w:pPr>
-        <w:spacing w:before="400"/>
-      </w:pPr>
-    </w:p>
-    <w:p>
-      <w:r>
-        <w:rPr>
-          <w:b/>
-          <w:color w:val="9945FF"/>
-          <w:sz w:val="26"/>
-        </w:rPr>
-        <w:t>Инструкции для проверяющего (преподавателя)</w:t>
-      </w:r>
-    </w:p>
-    <w:p>
-      <w:r>
-        <w:t>Каждое задание оформлено как автономный проект со своим файлом README.md, содержащим подробное описание, архитектурную схему и консольные команды для сборки и запуска:</w:t>
-        <w:br/>
-      </w:r>
-    </w:p>
-    <w:p>
-      <w:pPr>
-        <w:pStyle w:val="ListBullet"/>
-        <w:spacing w:after="40"/>
-      </w:pPr>
-      <w:r>
-        <w:t>Неделя 3: Перейти в week3_rust_cli и выполнить: cargo run -- demo</w:t>
-      </w:r>
-    </w:p>
-    <w:p>
-      <w:pPr>
-        <w:pStyle w:val="ListBullet"/>
-        <w:spacing w:after="40"/>
-      </w:pPr>
-      <w:r>
-        <w:t>Неделя 4: Код контракта расположен в week4_solana_program/src/lib.rs, запуск клиента: cd week4_solana_program/client &amp;&amp; npm start</w:t>
-      </w:r>
-    </w:p>
-    <w:p>
-      <w:pPr>
-        <w:pStyle w:val="ListBullet"/>
-        <w:spacing w:after="40"/>
-      </w:pPr>
-      <w:r>
-        <w:t>Неделя 5: Код контракта на Anchor в week5_anchor_counter/programs/counter/src/lib.rs, тесты: anchor test, клиент: npm start</w:t>
-      </w:r>
-    </w:p>
-    <w:p>
-      <w:pPr>
-        <w:pStyle w:val="ListBullet"/>
-        <w:spacing w:after="40"/>
-      </w:pPr>
-      <w:r>
-        <w:t>Неделя 6: Код контракта с PDA в week6_pda_user_profile/programs/user_profile/src/lib.rs, тесты с проверкой возврата рента: anchor test</w:t>
-      </w:r>
-    </w:p>
-    <w:p>
-      <w:pPr>
-        <w:pStyle w:val="ListBullet"/>
-        <w:spacing w:after="40"/>
-      </w:pPr>
-      <w:r>
-        <w:t>Неделя 7: Полный сквозной цикл выпуска токена и транзакций в Devnet: cd week7_spl_tokens &amp;&amp; npm start</w:t>
-      </w:r>
-    </w:p>
     <w:sectPr>
       <w:pgSz w:w="12240" w:h="15840"/>
-      <w:pgMar w:top="1152" w:right="1296" w:bottom="1152" w:left="1296" w:header="720" w:footer="720" w:gutter="0"/>
+      <w:pgMar w:top="1152" w:right="1224" w:bottom="1152" w:left="1224" w:header="720" w:footer="720" w:gutter="0"/>
       <w:cols w:space="720"/>
       <w:docGrid w:linePitch="360"/>
     </w:sectPr>
@@ -2082,7 +1880,7 @@
     </w:pPr>
     <w:rPr>
       <w:rFonts w:ascii="Calibri" w:hAnsi="Calibri"/>
-      <w:color w:val="181E2A"/>
+      <w:color w:val="232832"/>
       <w:sz w:val="22"/>
     </w:rPr>
   </w:style>

</xml_diff>

<commit_message>
Update authors and demo names to Dimash and Timur
</commit_message>
<xml_diff>
--- a/Отчет_по_заданиям_Solana_3-7.docx
+++ b/Отчет_по_заданиям_Solana_3-7.docx
@@ -36,7 +36,7 @@
           <w:color w:val="646E7D"/>
           <w:sz w:val="22"/>
         </w:rPr>
-        <w:t>Дисциплина: Startup / Web3 • Выполнил: Nerdlin</w:t>
+        <w:t>Дисциплина: Startup / Web3 • Выполнили: Димаш и Тимур</w:t>
       </w:r>
     </w:p>
     <w:tbl>
@@ -67,7 +67,7 @@
                 <w:b/>
                 <w:sz w:val="20"/>
               </w:rPr>
-              <w:t>Студент:</w:t>
+              <w:t>Студенты / Авторы:</w:t>
             </w:r>
           </w:p>
         </w:tc>
@@ -87,7 +87,7 @@
               <w:rPr>
                 <w:sz w:val="20"/>
               </w:rPr>
-              <w:t>Nerdlin</w:t>
+              <w:t>Димаш и Тимур</w:t>
             </w:r>
           </w:p>
         </w:tc>
@@ -343,7 +343,7 @@
               <w:rPr>
                 <w:sz w:val="19"/>
               </w:rPr>
-              <w:t>В папке week3_rust_cli выполнить: cargo run -- demo. Программа наглядно выполнит сериализацию, инициализирует счетчик, сделает перевод лампортов и покажет перехват ошибок при нехватке денег или отсутствии подписи.</w:t>
+              <w:t>В папке week3_rust_cli выполнить: cargo run -- demo. Программа наглядно выполнит сериализацию, создаст тестовые аккаунты Димаша и Тимура, инициализирует счетчик, сделает перевод лампортов и покажет перехват ошибок при нехватке денег или отсутствии подписи.</w:t>
             </w:r>
           </w:p>
         </w:tc>
@@ -889,7 +889,7 @@
         <w:t xml:space="preserve">3. Чеканка токенов (03_mint_tokens.ts): </w:t>
       </w:r>
       <w:r>
-        <w:t>Создание связанного токен-аккаунта (ATA) для кошелька создателя и чеканка 50 000 токенов (MintTo).</w:t>
+        <w:t>Создание связанного токен-аккаунта (ATA) для кошелька Димаша и чеканка 50 000 токенов (MintTo).</w:t>
       </w:r>
     </w:p>
     <w:p>
@@ -901,10 +901,10 @@
         <w:rPr>
           <w:b/>
         </w:rPr>
-        <w:t xml:space="preserve">4. Перевод другому владельцу (04_transfer_tokens.ts): </w:t>
+        <w:t xml:space="preserve">4. Перевод получателю (04_transfer_tokens.ts): </w:t>
       </w:r>
       <w:r>
-        <w:t>Генерация второго кошелька (Bob), создание его ATA и перевод 1 500 токенов с подтверждением транзакции.</w:t>
+        <w:t>Генерация кошелька Тимура, создание его ATA и перевод 1 500 токенов от Димаша с подтверждением транзакции.</w:t>
       </w:r>
     </w:p>
     <w:p>

</xml_diff>

<commit_message>
Update Word document report for Ilya Kovalenko with Helius info
</commit_message>
<xml_diff>
--- a/Отчет_по_заданиям_Solana_3-7.docx
+++ b/Отчет_по_заданиям_Solana_3-7.docx
@@ -36,7 +36,7 @@
           <w:color w:val="646E7D"/>
           <w:sz w:val="22"/>
         </w:rPr>
-        <w:t>Дисциплина: Startup / Web3 • Выполнили: Димаш и Тимур</w:t>
+        <w:t>Дисциплина: Startup / Web3 • Выполнил: Илья Коваленко</w:t>
       </w:r>
     </w:p>
     <w:tbl>
@@ -67,7 +67,7 @@
                 <w:b/>
                 <w:sz w:val="20"/>
               </w:rPr>
-              <w:t>Студенты / Авторы:</w:t>
+              <w:t>Студент / Автор:</w:t>
             </w:r>
           </w:p>
         </w:tc>
@@ -87,7 +87,7 @@
               <w:rPr>
                 <w:sz w:val="20"/>
               </w:rPr>
-              <w:t>Димаш и Тимур</w:t>
+              <w:t>Илья Коваленко</w:t>
             </w:r>
           </w:p>
         </w:tc>
@@ -173,7 +173,7 @@
               <w:rPr>
                 <w:sz w:val="20"/>
               </w:rPr>
-              <w:t>Rust, Borsh, solana-program, Anchor 0.30, TypeScript, @solana/web3.js, @solana/spl-token, Metaplex</w:t>
+              <w:t>Rust, Borsh, solana-program, Anchor 0.30, TypeScript, @solana/web3.js, @solana/spl-token, Metaplex, Helius</w:t>
             </w:r>
           </w:p>
         </w:tc>
@@ -195,7 +195,7 @@
         <w:t xml:space="preserve">О чем эта работа: </w:t>
       </w:r>
       <w:r>
-        <w:t>В этом отчете собрано описание пяти практических заданий курса. Цель — последовательно пройти путь создания смарт-контрактов для Solana: разобраться с низкоуровневой моделью аккаунтов и сериализацией на Rust, задеплоить первую нативную программу в Devnet, перейти на современный фреймворк Anchor, реализовать хранение данных через PDA и настроить выпуск и переводы собственных токенов стандарта SPL.</w:t>
+        <w:t>В этом отчете собрано описание пяти практических заданий курса. Цель — последовательно пройти путь создания смарт-контрактов для Solana: разобраться с низкоуровневой моделью аккаунтов и сериализацией на Rust, задеплоить первую нативную программу в Devnet, перейти на современный фреймворк Anchor, реализовать хранение данных через PDA, настроить выпуск и переводы собственных токенов стандарта SPL, а также подключить выделенный RPC Helius.</w:t>
       </w:r>
     </w:p>
     <w:p>
@@ -227,11 +227,11 @@
         <w:rPr>
           <w:b/>
         </w:rPr>
-        <w:t>Что я сделал и почему именно так:</w:t>
+        <w:t>Что сделано:</w:t>
         <w:br/>
       </w:r>
       <w:r>
-        <w:t>Вместо абстрактных примеров я написал эмулятор рантайма Solana (папка week3_rust_cli), который моделирует, как блокчейн обрабатывает транзакции и изменяет состояние аккаунтов. В коде применены ключевые вещи, без которых смарт-контракты не пишутся:</w:t>
+        <w:t>В папке week3_rust_cli написан эмулятор рантайма Solana, моделирующий обработку транзакций и изменение состояния аккаунтов. В коде применены ключевые механизмы:</w:t>
         <w:br/>
       </w:r>
     </w:p>
@@ -247,7 +247,7 @@
         <w:t xml:space="preserve">Сериализация Borsh: </w:t>
       </w:r>
       <w:r>
-        <w:t>Solana не использует тяжелый JSON — все данные сериализуются в компактный бинарный формат Borsh. В проекте через derive макросы запаковываются и инструкции (ProgramInstruction), и структуры состояния (CounterState, UserProfileState).</w:t>
+        <w:t>Все данные упаковываются в компактный бинарный формат Borsh через derive макросы (ProgramInstruction, CounterState, UserProfileState).</w:t>
       </w:r>
     </w:p>
     <w:p>
@@ -262,7 +262,7 @@
         <w:t xml:space="preserve">Модель аккаунтов (Account &amp; Pubkey): </w:t>
       </w:r>
       <w:r>
-        <w:t>Описал структуру аккаунта: 32-байтный публичный ключ, баланс в лампортах, буфер данных и флаги signer (подписана ли транзакция владельцем) и writable (можно ли менять).</w:t>
+        <w:t>Реализована структура аккаунта: 32-байтный публичный ключ, баланс в лампортах, буфер данных и флаги signer и writable.</w:t>
       </w:r>
     </w:p>
     <w:p>
@@ -277,7 +277,7 @@
         <w:t xml:space="preserve">Точка входа процессора: </w:t>
       </w:r>
       <w:r>
-        <w:t>Функция Processor::process в точности повторяет сигнатуру стандартного entrypoint Solana: принимает program_id, срез аккаунтов и сырые байты инструкции.</w:t>
+        <w:t>Функция Processor::process воспроизводит сигнатуру стандартного entrypoint Solana: принимает program_id, срез аккаунтов и сырые байты инструкции.</w:t>
       </w:r>
     </w:p>
     <w:p>
@@ -292,7 +292,7 @@
         <w:t xml:space="preserve">Borrow Checker и split_at_mut: </w:t>
       </w:r>
       <w:r>
-        <w:t>В Rust нельзя одновременно взять две мутабельные ссылки на элементы одного вектора. Чтобы списать деньги с одного аккаунта и зачислить на другой, используется accounts.split_at_mut(1) — ровно так, как это делается в реальных контрактах.</w:t>
+        <w:t>Для перевода средств между двумя аккаунтами используется безопасное разделение среза accounts.split_at_mut(1).</w:t>
       </w:r>
     </w:p>
     <w:p>
@@ -307,7 +307,7 @@
         <w:t xml:space="preserve">Защищенная арифметика: </w:t>
       </w:r>
       <w:r>
-        <w:t>Все вычисления балансов и счетчиков сделаны через checked_add и checked_sub с возвратом ошибки ProgramError::ArithmeticOverflow при переполнении.</w:t>
+        <w:t>Все вычисления балансов и счетчиков сделаны через checked_add и checked_sub с защитой от переполнения.</w:t>
       </w:r>
     </w:p>
     <w:tbl>
@@ -343,7 +343,7 @@
               <w:rPr>
                 <w:sz w:val="19"/>
               </w:rPr>
-              <w:t>В папке week3_rust_cli выполнить: cargo run -- demo. Программа наглядно выполнит сериализацию, создаст тестовые аккаунты Димаша и Тимура, инициализирует счетчик, сделает перевод лампортов и покажет перехват ошибок при нехватке денег или отсутствии подписи.</w:t>
+              <w:t>В папке week3_rust_cli выполнить: cargo run -- demo. Программа наглядно выполнит сериализацию, инициализирует счетчик, сделает перевод лампортов и покажет перехват ошибок.</w:t>
             </w:r>
           </w:p>
         </w:tc>
@@ -403,7 +403,7 @@
         <w:t xml:space="preserve">Контракт (src/lib.rs): </w:t>
       </w:r>
       <w:r>
-        <w:t>Написан на базе библиотеки solana-program. Содержит точку входа entrypoint!(process_instruction) и логирование событий в ончейн msg!().</w:t>
+        <w:t>Написан на базе библиотеки solana-program. Точка входа entrypoint!(process_instruction) и логирование msg!().</w:t>
       </w:r>
     </w:p>
     <w:p>
@@ -418,7 +418,7 @@
         <w:t xml:space="preserve">Проверка владельца (Owner check): </w:t>
       </w:r>
       <w:r>
-        <w:t>Обязательное правило безопасности Solana: программа обязательно проверяет account.owner == program_id. Если аккаунт принадлежит кому-то другому, программа отказывается его менять и возвращает ошибку.</w:t>
+        <w:t>Обязательная проверка account.owner == program_id для защиты от несанкционированной перезаписи.</w:t>
       </w:r>
     </w:p>
     <w:p>
@@ -430,10 +430,10 @@
         <w:rPr>
           <w:b/>
         </w:rPr>
-        <w:t xml:space="preserve">Состояние счетчика (GreetingAccount): </w:t>
+        <w:t xml:space="preserve">Счетчик вызовов: </w:t>
       </w:r>
       <w:r>
-        <w:t>В аккаунте хранится количество вызовов программы и кастомная строка с сообщением, которую можно передать в транзакции.</w:t>
+        <w:t>В аккаунте GreetingAccount сохраняется количество обращений и кастомная строка-сообщение.</w:t>
       </w:r>
     </w:p>
     <w:p>
@@ -445,25 +445,10 @@
         <w:rPr>
           <w:b/>
         </w:rPr>
-        <w:t xml:space="preserve">Клиент на @solana/web3.js (client/client.ts): </w:t>
+        <w:t xml:space="preserve">Клиент на @solana/web3.js: </w:t>
       </w:r>
       <w:r>
-        <w:t>Клиент подключается к Devnet, запрашивает аирдроп тестовых SOL, рассчитывает стоимость освобождения от арендной платы (Rent Exemption), создает аккаунт данных и отправляет транзакцию на вызов контракта.</w:t>
-      </w:r>
-    </w:p>
-    <w:p>
-      <w:pPr>
-        <w:pStyle w:val="ListBullet"/>
-        <w:spacing w:after="40"/>
-      </w:pPr>
-      <w:r>
-        <w:rPr>
-          <w:b/>
-        </w:rPr>
-        <w:t xml:space="preserve">Деплой: </w:t>
-      </w:r>
-      <w:r>
-        <w:t>Программу проще всего задеплоить через веб-инструмент Solana Playground (beta.solpg.io) — достаточно вставить код из src/lib.rs, нажать Build и Deploy.</w:t>
+        <w:t>Клиент подключается к Devnet (с поддержкой Helius RPC), рассчитывает Rent Exemption, создает аккаунт данных и отправляет транзакцию.</w:t>
       </w:r>
     </w:p>
     <w:tbl>
@@ -499,7 +484,7 @@
               <w:rPr>
                 <w:sz w:val="19"/>
               </w:rPr>
-              <w:t>Для взаимодействия с задеплоенной программой перейти в week4_solana_program/client, выполнить npm install и npx ts-node client.ts &lt;ID_ПРОГРАММЫ&gt;. Клиент выведет прямую ссылку на транзакцию в Solana Explorer.</w:t>
+              <w:t>Клиент запускается из week4_solana_program/client через npx ts-node client.ts &lt;ID_ПРОГРАММЫ&gt; и возвращает ссылку на транзакцию в Solana Explorer.</w:t>
             </w:r>
           </w:p>
         </w:tc>
@@ -535,16 +520,18 @@
       </w:r>
     </w:p>
     <w:p>
+      <w:pPr>
+        <w:pStyle w:val="ListBullet"/>
+        <w:spacing w:after="40"/>
+      </w:pPr>
       <w:r>
         <w:rPr>
           <w:b/>
         </w:rPr>
-        <w:t>Зачем нужен Anchor и что реализовано:</w:t>
-        <w:br/>
+        <w:t xml:space="preserve">Инструкции: </w:t>
       </w:r>
       <w:r>
-        <w:t>В нативном Rust разработчику приходится писать сотни строк рутинного кода для проверки аккаунтов и парсинга байтов. Anchor решает эту проблему декларативными макросами #[derive(Accounts)]. В проекте week5_anchor_counter реализовано:</w:t>
-        <w:br/>
+        <w:t>initialize (создание счетчика), increment (+1), decrement (-1) и set_value (установка числа).</w:t>
       </w:r>
     </w:p>
     <w:p>
@@ -556,25 +543,10 @@
         <w:rPr>
           <w:b/>
         </w:rPr>
-        <w:t xml:space="preserve">Инструкции: </w:t>
+        <w:t xml:space="preserve">Защита от Underflow: </w:t>
       </w:r>
       <w:r>
-        <w:t>initialize (создание счетчика и привязка authority), increment (увеличение на 1), decrement (уменьшение на 1) и set_value (установка конкретного числа владельцем).</w:t>
-      </w:r>
-    </w:p>
-    <w:p>
-      <w:pPr>
-        <w:pStyle w:val="ListBullet"/>
-        <w:spacing w:after="40"/>
-      </w:pPr>
-      <w:r>
-        <w:rPr>
-          <w:b/>
-        </w:rPr>
-        <w:t xml:space="preserve">Защита от ухода в минус: </w:t>
-      </w:r>
-      <w:r>
-        <w:t>В инструкции decrement добавлено строгое условие require!(counter.count &gt; 0, ErrorCode::Underflow). Если счетчик уже равен 0, транзакция прерывается с понятной ошибкой.</w:t>
+        <w:t>В инструкции decrement добавлено условие require!(counter.count &gt; 0, ErrorCode::Underflow).</w:t>
       </w:r>
     </w:p>
     <w:p>
@@ -589,7 +561,7 @@
         <w:t xml:space="preserve">Проверка прав: </w:t>
       </w:r>
       <w:r>
-        <w:t>В set_value использован констрейнт has_one = authority @ ErrorCode::Unauthorized. Никто, кроме создателя этого счетчика, не сможет принудительно изменить его значение.</w:t>
+        <w:t>В set_value применен констрейнт has_one = authority @ ErrorCode::Unauthorized.</w:t>
       </w:r>
     </w:p>
     <w:p>
@@ -601,10 +573,10 @@
         <w:rPr>
           <w:b/>
         </w:rPr>
-        <w:t xml:space="preserve">Тесты на Mocha/Chai (tests/counter.ts): </w:t>
+        <w:t xml:space="preserve">Тесты на Mocha/Chai: </w:t>
       </w:r>
       <w:r>
-        <w:t>Написаны тесты под все сценарии, включая проверку того, что ошибка Underflow действительно выбрасывается при попытке уйти в минус.</w:t>
+        <w:t>Реализованы тесты в tests/counter.ts, проверяющие логику и отлов ошибок.</w:t>
       </w:r>
     </w:p>
     <w:p>
@@ -616,10 +588,10 @@
         <w:rPr>
           <w:b/>
         </w:rPr>
-        <w:t xml:space="preserve">Клиент (client/interact.ts): </w:t>
+        <w:t xml:space="preserve">Клиент: </w:t>
       </w:r>
       <w:r>
-        <w:t>Готовый скрипт для вызова инструкций через сгенерированный IDL на Devnet.</w:t>
+        <w:t>Скрипт client/interact.ts готов для отправки инструкций в Devnet через IDL.</w:t>
       </w:r>
     </w:p>
     <w:tbl>
@@ -655,7 +627,7 @@
               <w:rPr>
                 <w:sz w:val="19"/>
               </w:rPr>
-              <w:t>Тесты запускаются командой anchor test (или во вкладке Test в Solana Playground). Клиент запускается из папки client через npm start.</w:t>
+              <w:t>Тесты запускаются командой anchor test, клиент — через npm start в папке client.</w:t>
             </w:r>
           </w:p>
         </w:tc>
@@ -691,16 +663,18 @@
       </w:r>
     </w:p>
     <w:p>
+      <w:pPr>
+        <w:pStyle w:val="ListBullet"/>
+        <w:spacing w:after="40"/>
+      </w:pPr>
       <w:r>
         <w:rPr>
           <w:b/>
         </w:rPr>
-        <w:t>Что такое PDA и как устроен профиль:</w:t>
-        <w:br/>
+        <w:t xml:space="preserve">Принцип PDA: </w:t>
       </w:r>
       <w:r>
-        <w:t>PDA (Program Derived Address) — это одна из главных фишек Solana. Это адрес, который детерминированно вычисляется из строковых сидов и ID программы: seeds = [b'user-profile', wallet_pubkey]. У PDA нет приватного ключа — подписывать за него транзакции может только смарт-контракт. В папке week6_pda_user_profile реализовано:</w:t>
-        <w:br/>
+        <w:t>Адрес профиля детерминированно вычисляется из сидов seeds = [b'user-profile', wallet_pubkey], исключая создание дублирующих профилей.</w:t>
       </w:r>
     </w:p>
     <w:p>
@@ -712,10 +686,10 @@
         <w:rPr>
           <w:b/>
         </w:rPr>
-        <w:t xml:space="preserve">Гарантия одного профиля: </w:t>
+        <w:t xml:space="preserve">Структура UserProfile: </w:t>
       </w:r>
       <w:r>
-        <w:t>Так как адрес PDA привязан к публичному ключу кошелька, один пользователь физически не может наплодить дублирующие профили — адрес всегда один и тот же.</w:t>
+        <w:t>Хранит authority, username (до 32 символов), bio (до 128 символов) и avatar_url (до 128 символов).</w:t>
       </w:r>
     </w:p>
     <w:p>
@@ -727,40 +701,10 @@
         <w:rPr>
           <w:b/>
         </w:rPr>
-        <w:t xml:space="preserve">Хранилище данных (UserProfile): </w:t>
+        <w:t xml:space="preserve">Возврат рента (close constraint): </w:t>
       </w:r>
       <w:r>
-        <w:t>В аккаунте хранятся authority (владелец), username (до 32 символов), bio (до 128 символов) и avatar_url (до 128 символов).</w:t>
-      </w:r>
-    </w:p>
-    <w:p>
-      <w:pPr>
-        <w:pStyle w:val="ListBullet"/>
-        <w:spacing w:after="40"/>
-      </w:pPr>
-      <w:r>
-        <w:rPr>
-          <w:b/>
-        </w:rPr>
-        <w:t xml:space="preserve">Контроль размера строк: </w:t>
-      </w:r>
-      <w:r>
-        <w:t>Размеры полей жестко валидируются в контракте через require!, чтобы не допустить раздувания размера аккаунта.</w:t>
-      </w:r>
-    </w:p>
-    <w:p>
-      <w:pPr>
-        <w:pStyle w:val="ListBullet"/>
-        <w:spacing w:after="40"/>
-      </w:pPr>
-      <w:r>
-        <w:rPr>
-          <w:b/>
-        </w:rPr>
-        <w:t xml:space="preserve">Удаление с возвратом депозита (close constraint): </w:t>
-      </w:r>
-      <w:r>
-        <w:t>В инструкции delete_profile использован констрейнт close = authority. Когда пользователь решает удалить профиль, аккаунт закрывается в блокчейне, а все замороженные за аренду SOL возвращаются обратно на его кошелек.</w:t>
+        <w:t>При вызове delete_profile аккаунт закрывается через close = authority, а все замороженные за аренду SOL возвращаются на баланс кошелька.</w:t>
       </w:r>
     </w:p>
     <w:tbl>
@@ -796,7 +740,7 @@
               <w:rPr>
                 <w:sz w:val="19"/>
               </w:rPr>
-              <w:t>Тест tests/user_profile.ts проверяет создание профиля, обновление данных, валидацию длины и факт возврата средств при закрытии аккаунта.</w:t>
+              <w:t>Тест tests/user_profile.ts и клиент client/client.ts подтверждают создание, обновление и удаление профиля.</w:t>
             </w:r>
           </w:p>
         </w:tc>
@@ -832,19 +776,18 @@
       </w:r>
     </w:p>
     <w:p>
+      <w:pPr>
+        <w:pStyle w:val="ListBullet"/>
+        <w:spacing w:after="40"/>
+      </w:pPr>
       <w:r>
         <w:rPr>
           <w:b/>
         </w:rPr>
-        <w:t>Как работают токены в Solana:</w:t>
-        <w:br/>
+        <w:t xml:space="preserve">1. Создание токена: </w:t>
       </w:r>
       <w:r>
-        <w:t>В Ethereum под каждый новый токен деплоят отдельный контракт стандарта ERC-20. В Solana все устроено гораздо быстрее и экономнее: в сети уже работает системная программа SPL Token Program. Мы создаем Mint-аккаунт (параметры самого токена) и ATA (Associated Token Account) — персональные хранилища токена для каждого конкретного пользователя.</w:t>
-        <w:br/>
-        <w:br/>
-        <w:t>В папке week7_spl_tokens подготовлен скрипт, автоматизирующий весь процесс в Devnet:</w:t>
-        <w:br/>
+        <w:t>Создание Mint-аккаунта токена с точностью 9 знаков после запятой.</w:t>
       </w:r>
     </w:p>
     <w:p>
@@ -856,10 +799,10 @@
         <w:rPr>
           <w:b/>
         </w:rPr>
-        <w:t xml:space="preserve">1. Создание токена (01_create_mint.ts): </w:t>
+        <w:t xml:space="preserve">2. Метаданные Metaplex: </w:t>
       </w:r>
       <w:r>
-        <w:t>Создание Mint аккаунта с точностью 9 десятичных знаков (decimals = 9).</w:t>
+        <w:t>Прикрепление ончейн-метаданных стандарта Metaplex V3 (Название: 'Startup University Token', Символ: 'STARTUP').</w:t>
       </w:r>
     </w:p>
     <w:p>
@@ -871,10 +814,10 @@
         <w:rPr>
           <w:b/>
         </w:rPr>
-        <w:t xml:space="preserve">2. Метаданные Metaplex (02_create_metadata.ts): </w:t>
+        <w:t xml:space="preserve">3. Чеканка токенов: </w:t>
       </w:r>
       <w:r>
-        <w:t>Привязка официальных метаданных по стандарту Metaplex Token Metadata V3: название 'Startup University Token', символ 'STARTUP' и ссылка на логотип.</w:t>
+        <w:t>Создание ATA для кошелька создателя и выпуск 50 000 токенов (MintTo).</w:t>
       </w:r>
     </w:p>
     <w:p>
@@ -886,10 +829,10 @@
         <w:rPr>
           <w:b/>
         </w:rPr>
-        <w:t xml:space="preserve">3. Чеканка токенов (03_mint_tokens.ts): </w:t>
+        <w:t xml:space="preserve">4. Перевод: </w:t>
       </w:r>
       <w:r>
-        <w:t>Создание связанного токен-аккаунта (ATA) для кошелька Димаша и чеканка 50 000 токенов (MintTo).</w:t>
+        <w:t>Создание кошелька получателя и безопасный перевод 1 500 токенов с подтверждением транзакции.</w:t>
       </w:r>
     </w:p>
     <w:p>
@@ -901,25 +844,10 @@
         <w:rPr>
           <w:b/>
         </w:rPr>
-        <w:t xml:space="preserve">4. Перевод получателю (04_transfer_tokens.ts): </w:t>
+        <w:t xml:space="preserve">5. Аудит балансов: </w:t>
       </w:r>
       <w:r>
-        <w:t>Генерация кошелька Тимура, создание его ATA и перевод 1 500 токенов от Димаша с подтверждением транзакции.</w:t>
-      </w:r>
-    </w:p>
-    <w:p>
-      <w:pPr>
-        <w:pStyle w:val="ListBullet"/>
-        <w:spacing w:after="40"/>
-      </w:pPr>
-      <w:r>
-        <w:rPr>
-          <w:b/>
-        </w:rPr>
-        <w:t xml:space="preserve">5. Проверка балансов (05_check_balances.ts): </w:t>
-      </w:r>
-      <w:r>
-        <w:t>Чтение финального состояния токена из блокчейна: общий объем предложения (Total Supply) и остатки на кошельках.</w:t>
+        <w:t>Чтение финального состояния токена и балансов из блокчейна.</w:t>
       </w:r>
     </w:p>
     <w:tbl>
@@ -955,7 +883,7 @@
               <w:rPr>
                 <w:sz w:val="19"/>
               </w:rPr>
-              <w:t>Сквозной запуск всего цикла: перейти в week7_spl_tokens и выполнить npm start. Скрипт сам запросит аирдроп SOL, создаст токен, отчеканит монеты, переведет часть на второй адрес и выведет ссылки на транзакции в Solana Explorer.</w:t>
+              <w:t>Сквозной запуск: cd week7_spl_tokens &amp;&amp; npm start. Скрипт использует Helius RPC и выводит ссылки на транзакции в Explorer.</w:t>
             </w:r>
           </w:p>
         </w:tc>

</xml_diff>